<commit_message>
docs: polish thesis 31 template draft
</commit_message>
<xml_diff>
--- a/manuscript/thesis_31.docx
+++ b/manuscript/thesis_31.docx
@@ -25,7 +25,7 @@
           <w:b/>
           <w:sz w:val="30"/>
         </w:rPr>
-        <w:t>Technical Report Template Adaptation - thesis_31</w:t>
+        <w:t>Technical Report Template Adaptation / MSc Thesis Draft</w:t>
       </w:r>
     </w:p>
     <w:p/>
@@ -104,7 +104,7 @@
               <w:rPr>
                 <w:sz w:val="18"/>
               </w:rPr>
-              <w:t>Project</w:t>
+              <w:t>Author</w:t>
             </w:r>
           </w:p>
         </w:tc>
@@ -124,7 +124,7 @@
               <w:rPr>
                 <w:sz w:val="18"/>
               </w:rPr>
-              <w:t>Synthetic HFMM reinforcement-learning thesis</w:t>
+              <w:t>Onur Emiroglu</w:t>
             </w:r>
           </w:p>
         </w:tc>
@@ -146,7 +146,7 @@
               <w:rPr>
                 <w:sz w:val="18"/>
               </w:rPr>
-              <w:t>Draft</w:t>
+              <w:t>Programme</w:t>
             </w:r>
           </w:p>
         </w:tc>
@@ -166,7 +166,7 @@
               <w:rPr>
                 <w:sz w:val="18"/>
               </w:rPr>
-              <w:t>manuscript/thesis_31.docx and manuscript/thesis_31.pdf</w:t>
+              <w:t>Financial Engineering MSc Programme</w:t>
             </w:r>
           </w:p>
         </w:tc>
@@ -188,7 +188,7 @@
               <w:rPr>
                 <w:sz w:val="18"/>
               </w:rPr>
-              <w:t>Frozen baseline</w:t>
+              <w:t>Institution</w:t>
             </w:r>
           </w:p>
         </w:tc>
@@ -208,7 +208,7 @@
               <w:rPr>
                 <w:sz w:val="18"/>
               </w:rPr>
-              <w:t>manuscript/thesis_29.pdf, tag thesis-v29-frozen</w:t>
+              <w:t>Karlsruhe Institute of Technology</w:t>
             </w:r>
           </w:p>
         </w:tc>
@@ -230,7 +230,7 @@
               <w:rPr>
                 <w:sz w:val="18"/>
               </w:rPr>
-              <w:t>Source draft</w:t>
+              <w:t>Supervisor</w:t>
             </w:r>
           </w:p>
         </w:tc>
@@ -250,7 +250,7 @@
               <w:rPr>
                 <w:sz w:val="18"/>
               </w:rPr>
-              <w:t>manuscript/thesis_30.pdf / .docx</w:t>
+              <w:t>[Supervisor to be inserted]</w:t>
             </w:r>
           </w:p>
         </w:tc>
@@ -272,7 +272,7 @@
               <w:rPr>
                 <w:sz w:val="18"/>
               </w:rPr>
-              <w:t>Decision log</w:t>
+              <w:t>Matriculation No.</w:t>
             </w:r>
           </w:p>
         </w:tc>
@@ -292,7 +292,7 @@
               <w:rPr>
                 <w:sz w:val="18"/>
               </w:rPr>
-              <w:t>manuscript/decisions_log_13.pdf</w:t>
+              <w:t>[Matriculation number to be inserted]</w:t>
             </w:r>
           </w:p>
         </w:tc>
@@ -314,7 +314,7 @@
               <w:rPr>
                 <w:sz w:val="18"/>
               </w:rPr>
-              <w:t>Scope</w:t>
+              <w:t>Submission / Draft date</w:t>
             </w:r>
           </w:p>
         </w:tc>
@@ -334,13 +334,192 @@
               <w:rPr>
                 <w:sz w:val="18"/>
               </w:rPr>
-              <w:t>Template adaptation only; no experiment reruns or figure regeneration</w:t>
+              <w:t>May 2026</w:t>
+            </w:r>
+          </w:p>
+        </w:tc>
+      </w:tr>
+      <w:tr>
+        <w:tc>
+          <w:tcPr>
+            <w:tcW w:type="dxa" w:w="2200"/>
+            <w:vAlign w:val="center"/>
+            <w:tcMar>
+              <w:top w:w="80" w:type="dxa"/>
+              <w:start w:w="120" w:type="dxa"/>
+              <w:bottom w:w="80" w:type="dxa"/>
+              <w:end w:w="120" w:type="dxa"/>
+            </w:tcMar>
+          </w:tcPr>
+          <w:p>
+            <w:r>
+              <w:rPr>
+                <w:sz w:val="18"/>
+              </w:rPr>
+              <w:t>Git Repository</w:t>
+            </w:r>
+          </w:p>
+        </w:tc>
+        <w:tc>
+          <w:tcPr>
+            <w:tcW w:type="dxa" w:w="7160"/>
+            <w:vAlign w:val="center"/>
+            <w:tcMar>
+              <w:top w:w="80" w:type="dxa"/>
+              <w:start w:w="120" w:type="dxa"/>
+              <w:bottom w:w="80" w:type="dxa"/>
+              <w:end w:w="120" w:type="dxa"/>
+            </w:tcMar>
+          </w:tcPr>
+          <w:p>
+            <w:r>
+              <w:rPr>
+                <w:sz w:val="18"/>
+              </w:rPr>
+              <w:t>[Repository URL to be inserted]</w:t>
+            </w:r>
+          </w:p>
+        </w:tc>
+      </w:tr>
+      <w:tr>
+        <w:tc>
+          <w:tcPr>
+            <w:tcW w:type="dxa" w:w="2200"/>
+            <w:vAlign w:val="center"/>
+            <w:tcMar>
+              <w:top w:w="80" w:type="dxa"/>
+              <w:start w:w="120" w:type="dxa"/>
+              <w:bottom w:w="80" w:type="dxa"/>
+              <w:end w:w="120" w:type="dxa"/>
+            </w:tcMar>
+          </w:tcPr>
+          <w:p>
+            <w:r>
+              <w:rPr>
+                <w:sz w:val="18"/>
+              </w:rPr>
+              <w:t>Frozen baseline</w:t>
+            </w:r>
+          </w:p>
+        </w:tc>
+        <w:tc>
+          <w:tcPr>
+            <w:tcW w:type="dxa" w:w="7160"/>
+            <w:vAlign w:val="center"/>
+            <w:tcMar>
+              <w:top w:w="80" w:type="dxa"/>
+              <w:start w:w="120" w:type="dxa"/>
+              <w:bottom w:w="80" w:type="dxa"/>
+              <w:end w:w="120" w:type="dxa"/>
+            </w:tcMar>
+          </w:tcPr>
+          <w:p>
+            <w:r>
+              <w:rPr>
+                <w:sz w:val="18"/>
+              </w:rPr>
+              <w:t>manuscript/thesis_29.pdf, tag thesis-v29-frozen</w:t>
+            </w:r>
+          </w:p>
+        </w:tc>
+      </w:tr>
+      <w:tr>
+        <w:tc>
+          <w:tcPr>
+            <w:tcW w:type="dxa" w:w="2200"/>
+            <w:vAlign w:val="center"/>
+            <w:tcMar>
+              <w:top w:w="80" w:type="dxa"/>
+              <w:start w:w="120" w:type="dxa"/>
+              <w:bottom w:w="80" w:type="dxa"/>
+              <w:end w:w="120" w:type="dxa"/>
+            </w:tcMar>
+          </w:tcPr>
+          <w:p>
+            <w:r>
+              <w:rPr>
+                <w:sz w:val="18"/>
+              </w:rPr>
+              <w:t>Source draft</w:t>
+            </w:r>
+          </w:p>
+        </w:tc>
+        <w:tc>
+          <w:tcPr>
+            <w:tcW w:type="dxa" w:w="7160"/>
+            <w:vAlign w:val="center"/>
+            <w:tcMar>
+              <w:top w:w="80" w:type="dxa"/>
+              <w:start w:w="120" w:type="dxa"/>
+              <w:bottom w:w="80" w:type="dxa"/>
+              <w:end w:w="120" w:type="dxa"/>
+            </w:tcMar>
+          </w:tcPr>
+          <w:p>
+            <w:r>
+              <w:rPr>
+                <w:sz w:val="18"/>
+              </w:rPr>
+              <w:t>manuscript/thesis_30.pdf / .docx</w:t>
+            </w:r>
+          </w:p>
+        </w:tc>
+      </w:tr>
+      <w:tr>
+        <w:tc>
+          <w:tcPr>
+            <w:tcW w:type="dxa" w:w="2200"/>
+            <w:vAlign w:val="center"/>
+            <w:tcMar>
+              <w:top w:w="80" w:type="dxa"/>
+              <w:start w:w="120" w:type="dxa"/>
+              <w:bottom w:w="80" w:type="dxa"/>
+              <w:end w:w="120" w:type="dxa"/>
+            </w:tcMar>
+          </w:tcPr>
+          <w:p>
+            <w:r>
+              <w:rPr>
+                <w:sz w:val="18"/>
+              </w:rPr>
+              <w:t>Decision log</w:t>
+            </w:r>
+          </w:p>
+        </w:tc>
+        <w:tc>
+          <w:tcPr>
+            <w:tcW w:type="dxa" w:w="7160"/>
+            <w:vAlign w:val="center"/>
+            <w:tcMar>
+              <w:top w:w="80" w:type="dxa"/>
+              <w:start w:w="120" w:type="dxa"/>
+              <w:bottom w:w="80" w:type="dxa"/>
+              <w:end w:w="120" w:type="dxa"/>
+            </w:tcMar>
+          </w:tcPr>
+          <w:p>
+            <w:r>
+              <w:rPr>
+                <w:sz w:val="18"/>
+              </w:rPr>
+              <w:t>manuscript/decisions_log_13.pdf</w:t>
             </w:r>
           </w:p>
         </w:tc>
       </w:tr>
     </w:tbl>
     <w:p/>
+    <w:p>
+      <w:pPr>
+        <w:jc w:val="center"/>
+      </w:pPr>
+      <w:r>
+        <w:rPr>
+          <w:b/>
+        </w:rPr>
+        <w:t>Template-adapted draft; frozen evidence is not regenerated.</w:t>
+      </w:r>
+    </w:p>
     <w:p>
       <w:r>
         <w:t>In the tested controlled synthetic HFMM environment, explicit categorical volatility-regime labels do not provide robust incremental value once sigma_hat is already observed by the PPO policy. The results are consistent with signal redundancy.</w:t>
@@ -855,6 +1034,384 @@
           </w:p>
         </w:tc>
       </w:tr>
+      <w:tr>
+        <w:tc>
+          <w:tcPr>
+            <w:tcW w:type="dxa" w:w="1600"/>
+            <w:vAlign w:val="center"/>
+            <w:tcMar>
+              <w:top w:w="80" w:type="dxa"/>
+              <w:start w:w="120" w:type="dxa"/>
+              <w:bottom w:w="80" w:type="dxa"/>
+              <w:end w:w="120" w:type="dxa"/>
+            </w:tcMar>
+          </w:tcPr>
+          <w:p>
+            <w:r>
+              <w:rPr>
+                <w:sz w:val="18"/>
+              </w:rPr>
+              <w:t>gamma</w:t>
+            </w:r>
+          </w:p>
+        </w:tc>
+        <w:tc>
+          <w:tcPr>
+            <w:tcW w:type="dxa" w:w="7760"/>
+            <w:vAlign w:val="center"/>
+            <w:tcMar>
+              <w:top w:w="80" w:type="dxa"/>
+              <w:start w:w="120" w:type="dxa"/>
+              <w:bottom w:w="80" w:type="dxa"/>
+              <w:end w:w="120" w:type="dxa"/>
+            </w:tcMar>
+          </w:tcPr>
+          <w:p>
+            <w:r>
+              <w:rPr>
+                <w:sz w:val="18"/>
+              </w:rPr>
+              <w:t>Avellaneda-Stoikov inventory-risk aversion parameter.</w:t>
+            </w:r>
+          </w:p>
+        </w:tc>
+      </w:tr>
+      <w:tr>
+        <w:tc>
+          <w:tcPr>
+            <w:tcW w:type="dxa" w:w="1600"/>
+            <w:vAlign w:val="center"/>
+            <w:tcMar>
+              <w:top w:w="80" w:type="dxa"/>
+              <w:start w:w="120" w:type="dxa"/>
+              <w:bottom w:w="80" w:type="dxa"/>
+              <w:end w:w="120" w:type="dxa"/>
+            </w:tcMar>
+          </w:tcPr>
+          <w:p>
+            <w:r>
+              <w:rPr>
+                <w:sz w:val="18"/>
+              </w:rPr>
+              <w:t>tau</w:t>
+            </w:r>
+          </w:p>
+        </w:tc>
+        <w:tc>
+          <w:tcPr>
+            <w:tcW w:type="dxa" w:w="7760"/>
+            <w:vAlign w:val="center"/>
+            <w:tcMar>
+              <w:top w:w="80" w:type="dxa"/>
+              <w:start w:w="120" w:type="dxa"/>
+              <w:bottom w:w="80" w:type="dxa"/>
+              <w:end w:w="120" w:type="dxa"/>
+            </w:tcMar>
+          </w:tcPr>
+          <w:p>
+            <w:r>
+              <w:rPr>
+                <w:sz w:val="18"/>
+              </w:rPr>
+              <w:t>Remaining horizon.</w:t>
+            </w:r>
+          </w:p>
+        </w:tc>
+      </w:tr>
+      <w:tr>
+        <w:tc>
+          <w:tcPr>
+            <w:tcW w:type="dxa" w:w="1600"/>
+            <w:vAlign w:val="center"/>
+            <w:tcMar>
+              <w:top w:w="80" w:type="dxa"/>
+              <w:start w:w="120" w:type="dxa"/>
+              <w:bottom w:w="80" w:type="dxa"/>
+              <w:end w:w="120" w:type="dxa"/>
+            </w:tcMar>
+          </w:tcPr>
+          <w:p>
+            <w:r>
+              <w:rPr>
+                <w:sz w:val="18"/>
+              </w:rPr>
+              <w:t>lambda(delta)</w:t>
+            </w:r>
+          </w:p>
+        </w:tc>
+        <w:tc>
+          <w:tcPr>
+            <w:tcW w:type="dxa" w:w="7760"/>
+            <w:vAlign w:val="center"/>
+            <w:tcMar>
+              <w:top w:w="80" w:type="dxa"/>
+              <w:start w:w="120" w:type="dxa"/>
+              <w:bottom w:w="80" w:type="dxa"/>
+              <w:end w:w="120" w:type="dxa"/>
+            </w:tcMar>
+          </w:tcPr>
+          <w:p>
+            <w:r>
+              <w:rPr>
+                <w:sz w:val="18"/>
+              </w:rPr>
+              <w:t>Poisson fill intensity at quote distance delta.</w:t>
+            </w:r>
+          </w:p>
+        </w:tc>
+      </w:tr>
+      <w:tr>
+        <w:tc>
+          <w:tcPr>
+            <w:tcW w:type="dxa" w:w="1600"/>
+            <w:vAlign w:val="center"/>
+            <w:tcMar>
+              <w:top w:w="80" w:type="dxa"/>
+              <w:start w:w="120" w:type="dxa"/>
+              <w:bottom w:w="80" w:type="dxa"/>
+              <w:end w:w="120" w:type="dxa"/>
+            </w:tcMar>
+          </w:tcPr>
+          <w:p>
+            <w:r>
+              <w:rPr>
+                <w:sz w:val="18"/>
+              </w:rPr>
+              <w:t>delta, delta_bid, delta_ask</w:t>
+            </w:r>
+          </w:p>
+        </w:tc>
+        <w:tc>
+          <w:tcPr>
+            <w:tcW w:type="dxa" w:w="7760"/>
+            <w:vAlign w:val="center"/>
+            <w:tcMar>
+              <w:top w:w="80" w:type="dxa"/>
+              <w:start w:w="120" w:type="dxa"/>
+              <w:bottom w:w="80" w:type="dxa"/>
+              <w:end w:w="120" w:type="dxa"/>
+            </w:tcMar>
+          </w:tcPr>
+          <w:p>
+            <w:r>
+              <w:rPr>
+                <w:sz w:val="18"/>
+              </w:rPr>
+              <w:t>Quote distance variables.</w:t>
+            </w:r>
+          </w:p>
+        </w:tc>
+      </w:tr>
+      <w:tr>
+        <w:tc>
+          <w:tcPr>
+            <w:tcW w:type="dxa" w:w="1600"/>
+            <w:vAlign w:val="center"/>
+            <w:tcMar>
+              <w:top w:w="80" w:type="dxa"/>
+              <w:start w:w="120" w:type="dxa"/>
+              <w:bottom w:w="80" w:type="dxa"/>
+              <w:end w:w="120" w:type="dxa"/>
+            </w:tcMar>
+          </w:tcPr>
+          <w:p>
+            <w:r>
+              <w:rPr>
+                <w:sz w:val="18"/>
+              </w:rPr>
+              <w:t>rho_t(theta)</w:t>
+            </w:r>
+          </w:p>
+        </w:tc>
+        <w:tc>
+          <w:tcPr>
+            <w:tcW w:type="dxa" w:w="7760"/>
+            <w:vAlign w:val="center"/>
+            <w:tcMar>
+              <w:top w:w="80" w:type="dxa"/>
+              <w:start w:w="120" w:type="dxa"/>
+              <w:bottom w:w="80" w:type="dxa"/>
+              <w:end w:w="120" w:type="dxa"/>
+            </w:tcMar>
+          </w:tcPr>
+          <w:p>
+            <w:r>
+              <w:rPr>
+                <w:sz w:val="18"/>
+              </w:rPr>
+              <w:t>PPO probability ratio.</w:t>
+            </w:r>
+          </w:p>
+        </w:tc>
+      </w:tr>
+      <w:tr>
+        <w:tc>
+          <w:tcPr>
+            <w:tcW w:type="dxa" w:w="1600"/>
+            <w:vAlign w:val="center"/>
+            <w:tcMar>
+              <w:top w:w="80" w:type="dxa"/>
+              <w:start w:w="120" w:type="dxa"/>
+              <w:bottom w:w="80" w:type="dxa"/>
+              <w:end w:w="120" w:type="dxa"/>
+            </w:tcMar>
+          </w:tcPr>
+          <w:p>
+            <w:r>
+              <w:rPr>
+                <w:sz w:val="18"/>
+              </w:rPr>
+              <w:t>A_hat_t</w:t>
+            </w:r>
+          </w:p>
+        </w:tc>
+        <w:tc>
+          <w:tcPr>
+            <w:tcW w:type="dxa" w:w="7760"/>
+            <w:vAlign w:val="center"/>
+            <w:tcMar>
+              <w:top w:w="80" w:type="dxa"/>
+              <w:start w:w="120" w:type="dxa"/>
+              <w:bottom w:w="80" w:type="dxa"/>
+              <w:end w:w="120" w:type="dxa"/>
+            </w:tcMar>
+          </w:tcPr>
+          <w:p>
+            <w:r>
+              <w:rPr>
+                <w:sz w:val="18"/>
+              </w:rPr>
+              <w:t>Advantage estimate.</w:t>
+            </w:r>
+          </w:p>
+        </w:tc>
+      </w:tr>
+      <w:tr>
+        <w:tc>
+          <w:tcPr>
+            <w:tcW w:type="dxa" w:w="1600"/>
+            <w:vAlign w:val="center"/>
+            <w:tcMar>
+              <w:top w:w="80" w:type="dxa"/>
+              <w:start w:w="120" w:type="dxa"/>
+              <w:bottom w:w="80" w:type="dxa"/>
+              <w:end w:w="120" w:type="dxa"/>
+            </w:tcMar>
+          </w:tcPr>
+          <w:p>
+            <w:r>
+              <w:rPr>
+                <w:sz w:val="18"/>
+              </w:rPr>
+              <w:t>epsilon_t</w:t>
+            </w:r>
+          </w:p>
+        </w:tc>
+        <w:tc>
+          <w:tcPr>
+            <w:tcW w:type="dxa" w:w="7760"/>
+            <w:vAlign w:val="center"/>
+            <w:tcMar>
+              <w:top w:w="80" w:type="dxa"/>
+              <w:start w:w="120" w:type="dxa"/>
+              <w:bottom w:w="80" w:type="dxa"/>
+              <w:end w:w="120" w:type="dxa"/>
+            </w:tcMar>
+          </w:tcPr>
+          <w:p>
+            <w:r>
+              <w:rPr>
+                <w:sz w:val="18"/>
+              </w:rPr>
+              <w:t>Standard-normal innovation in the mid-price process.</w:t>
+            </w:r>
+          </w:p>
+        </w:tc>
+      </w:tr>
+      <w:tr>
+        <w:tc>
+          <w:tcPr>
+            <w:tcW w:type="dxa" w:w="1600"/>
+            <w:vAlign w:val="center"/>
+            <w:tcMar>
+              <w:top w:w="80" w:type="dxa"/>
+              <w:start w:w="120" w:type="dxa"/>
+              <w:bottom w:w="80" w:type="dxa"/>
+              <w:end w:w="120" w:type="dxa"/>
+            </w:tcMar>
+          </w:tcPr>
+          <w:p>
+            <w:r>
+              <w:rPr>
+                <w:sz w:val="18"/>
+              </w:rPr>
+              <w:t>z_t</w:t>
+            </w:r>
+          </w:p>
+        </w:tc>
+        <w:tc>
+          <w:tcPr>
+            <w:tcW w:type="dxa" w:w="7760"/>
+            <w:vAlign w:val="center"/>
+            <w:tcMar>
+              <w:top w:w="80" w:type="dxa"/>
+              <w:start w:w="120" w:type="dxa"/>
+              <w:bottom w:w="80" w:type="dxa"/>
+              <w:end w:w="120" w:type="dxa"/>
+            </w:tcMar>
+          </w:tcPr>
+          <w:p>
+            <w:r>
+              <w:rPr>
+                <w:sz w:val="18"/>
+              </w:rPr>
+              <w:t>Latent volatility regime.</w:t>
+            </w:r>
+          </w:p>
+        </w:tc>
+      </w:tr>
+      <w:tr>
+        <w:tc>
+          <w:tcPr>
+            <w:tcW w:type="dxa" w:w="1600"/>
+            <w:vAlign w:val="center"/>
+            <w:tcMar>
+              <w:top w:w="80" w:type="dxa"/>
+              <w:start w:w="120" w:type="dxa"/>
+              <w:bottom w:w="80" w:type="dxa"/>
+              <w:end w:w="120" w:type="dxa"/>
+            </w:tcMar>
+          </w:tcPr>
+          <w:p>
+            <w:r>
+              <w:rPr>
+                <w:sz w:val="18"/>
+              </w:rPr>
+              <w:t>P_ij</w:t>
+            </w:r>
+          </w:p>
+        </w:tc>
+        <w:tc>
+          <w:tcPr>
+            <w:tcW w:type="dxa" w:w="7760"/>
+            <w:vAlign w:val="center"/>
+            <w:tcMar>
+              <w:top w:w="80" w:type="dxa"/>
+              <w:start w:w="120" w:type="dxa"/>
+              <w:bottom w:w="80" w:type="dxa"/>
+              <w:end w:w="120" w:type="dxa"/>
+            </w:tcMar>
+          </w:tcPr>
+          <w:p>
+            <w:r>
+              <w:rPr>
+                <w:sz w:val="18"/>
+              </w:rPr>
+              <w:t>Markov transition probability.</w:t>
+            </w:r>
+          </w:p>
+        </w:tc>
+      </w:tr>
     </w:tbl>
     <w:p/>
     <w:tbl>
@@ -1523,11 +2080,7 @@
       </w:tr>
     </w:tbl>
     <w:p/>
-    <w:p>
-      <w:r>
-        <w:br w:type="page"/>
-      </w:r>
-    </w:p>
+    <w:p/>
     <w:p>
       <w:pPr>
         <w:pStyle w:val="Heading1"/>
@@ -1572,22 +2125,42 @@
     </w:p>
     <w:p>
       <w:r>
-        <w:t>Classical market-making models, especially the Avellaneda-Stoikov framework and later inventory-risk extensions, formalize the tradeoff between spread income and inventory exposure. They provide analytical baselines and clarify why volatility and inventory jointly affect reservation prices and spreads.</w:t>
+        <w:t>Classical market-making models provide the inventory-risk foundation for this thesis. A market maker earns spread income by posting bid and ask quotes, but execution imbalance creates inventory exposure whose value changes with the mid-price. The core control problem is therefore not raw spread capture alone; it is the tradeoff between execution probability, volatility risk, and inventory control.</w:t>
       </w:r>
     </w:p>
     <w:p>
       <w:r>
-        <w:t>Reinforcement-learning approaches to market making replace closed-form quoting rules with learned policies that can condition on state variables, simulated fills, and reward shaping. Prior DRL market-making work motivates the use of PPO-style policies, but it also raises a representation question: adding state channels can help only when they provide incremental information that the policy can exploit.</w:t>
+        <w:t>Avellaneda and Stoikov (2008) give the canonical analytical reference point: quotes are adjusted through a reservation price and spread term that depend on inventory, risk aversion, volatility, horizon, and order-arrival intensity. Gueant, Lehalle and Fernandez-Tapia (2013) extend this inventory-control view with tractable market-making solutions. In this report, that literature motivates both the AS baseline and the squared-inventory penalty used in the PPO reward.</w:t>
       </w:r>
     </w:p>
     <w:p>
       <w:r>
-        <w:t>Volatility regimes are a common way to summarize non-stationarity. In this thesis, regimes are generated by a three-state Markov process and estimated by rolling realized volatility. The literature motivates regime awareness, but the tested design asks a narrower question: whether the categorical regime label improves performance beyond the continuous realized-volatility proxy.</w:t>
+        <w:t>Reinforcement-learning market-making studies replace closed-form quote rules with learned policies trained through simulated interaction. Spooner et al. (2018) show how RL can learn market-making behavior and why reward design is central. Spooner and Savani (2020) extend the discussion toward robustness under adversarially varied conditions. These studies motivate learned quoting policies, but the present thesis is narrower: PPO is used as a controlled testbed for a state-representation question.</w:t>
       </w:r>
     </w:p>
     <w:p>
       <w:r>
-        <w:t>Because the main empirical result is a bounded null/equivalence-style finding, the report uses paired tests and TOST equivalence tests rather than relying only on non-significant p-values. This supports a defense-safe reading of practical equivalence where the evidence warrants it.</w:t>
+        <w:t>Deep reinforcement learning work with market signals is especially relevant. Gasperov and Kostanjcar (2021) study market making with signals through DRL, while Gasperov et al. (2021) summarize broader RL approaches to optimal market making. Gasperov and Kostanjcar (2022) use a richer Hawkes-process limit-order-book simulator. The thesis uses a simpler Poisson-fill simulator deliberately, because the goal is to isolate whether one added signal channel has incremental value.</w:t>
+      </w:r>
+    </w:p>
+    <w:p>
+      <w:r>
+        <w:t>Volatility regimes and non-stationarity are economically meaningful in market making. A higher-volatility state can increase inventory risk and change the appropriate quote aggressiveness. The thesis therefore includes a three-state Markov volatility process and rolling realized-volatility detector. However, the presence of regimes does not automatically imply that a categorical regime label improves a learned policy.</w:t>
+      </w:r>
+    </w:p>
+    <w:p>
+      <w:r>
+        <w:t>The key information-design issue is redundancy. The policy already observes sigma_hat, a continuous realized-volatility proxy. A low/medium/high label derived from related volatility information may help if it summarizes information not otherwise available, but it may add little if sigma_hat already carries the useful variation for quote placement.</w:t>
+      </w:r>
+    </w:p>
+    <w:p>
+      <w:r>
+        <w:t>This defines the thesis gap. The report does not ask whether volatility matters generally. It asks whether an explicit categorical volatility-regime label adds incremental value once sigma_hat is already observed by the PPO policy in the controlled synthetic HFMM environment.</w:t>
+      </w:r>
+    </w:p>
+    <w:p>
+      <w:r>
+        <w:t>Finally, the result requires careful null-result interpretation. Lakens (2017) and Lakens, Scheel and Isager (2018) motivate equivalence testing as a way to distinguish 'not statistically significant' from 'practically equivalent within a stated bound.' This is why the thesis reports both paired t-tests and TOST-style evidence where appropriate.</w:t>
       </w:r>
     </w:p>
     <w:p>
@@ -1690,7 +2263,7 @@
           <w:b/>
           <w:sz w:val="22"/>
         </w:rPr>
-        <w:t>S_{t+1} = S_t + sigma_t sqrt(dt) epsilon_t,   epsilon_t ~ N(0, 1)</w:t>
+        <w:t>(1)  S_{t+1} = S_t + sigma_t sqrt(dt) epsilon_t,   epsilon_t ~ N(0, 1)</w:t>
       </w:r>
     </w:p>
     <w:p>
@@ -1716,7 +2289,7 @@
           <w:b/>
           <w:sz w:val="22"/>
         </w:rPr>
-        <w:t>P(z_{t+1}=j | z_t=i) = P_ij,   z_t in {L, M, H}</w:t>
+        <w:t>(2)  P(z_{t+1}=j | z_t=i) = P_ij,   z_t in {L, M, H}</w:t>
       </w:r>
     </w:p>
     <w:p>
@@ -1747,7 +2320,7 @@
           <w:b/>
           <w:sz w:val="22"/>
         </w:rPr>
-        <w:t>sigma_hat_t = sqrt((1 / w) sum_{i=t-w+1}^{t} (Delta S_i)^2)</w:t>
+        <w:t>(3)  sigma_hat_t = sqrt((1 / w) sum_{i=t-w+1}^{t} (Delta S_i)^2)</w:t>
       </w:r>
     </w:p>
     <w:p>
@@ -1778,7 +2351,7 @@
           <w:b/>
           <w:sz w:val="22"/>
         </w:rPr>
-        <w:t>lambda(delta) = A exp(-k delta)</w:t>
+        <w:t>(4)  lambda(delta) = A exp(-k delta)</w:t>
       </w:r>
     </w:p>
     <w:p>
@@ -1796,7 +2369,7 @@
           <w:b/>
           <w:sz w:val="22"/>
         </w:rPr>
-        <w:t>P(fill | delta) = 1 - exp(-lambda(delta) dt)</w:t>
+        <w:t>(5)  P(fill | delta) = 1 - exp(-lambda(delta) dt)</w:t>
       </w:r>
     </w:p>
     <w:p>
@@ -1822,7 +2395,7 @@
           <w:b/>
           <w:sz w:val="22"/>
         </w:rPr>
-        <w:t>h = h_idx + 1,   m = m_idx - 2</w:t>
+        <w:t>(6)  h = h_idx + 1,   m = m_idx - 2</w:t>
       </w:r>
     </w:p>
     <w:p>
@@ -1840,7 +2413,7 @@
           <w:b/>
           <w:sz w:val="22"/>
         </w:rPr>
-        <w:t>delta_bid = max(1, h + m),   delta_ask = max(1, h - m)</w:t>
+        <w:t>(7)  delta_bid = max(1, h + m),   delta_ask = max(1, h - m)</w:t>
       </w:r>
     </w:p>
     <w:p>
@@ -1866,7 +2439,7 @@
           <w:b/>
           <w:sz w:val="22"/>
         </w:rPr>
-        <w:t>q_{t+1} = q_t + F_t^{bid} - F_t^{ask}</w:t>
+        <w:t>(8)  q_{t+1} = q_t + F_t^{bid} - F_t^{ask}</w:t>
       </w:r>
     </w:p>
     <w:p>
@@ -1884,7 +2457,7 @@
           <w:b/>
           <w:sz w:val="22"/>
         </w:rPr>
-        <w:t>X_{t+1} = X_t - F_t^{bid} P_t^{bid} + F_t^{ask} P_t^{ask} - fees_t</w:t>
+        <w:t>(9)  X_{t+1} = X_t - F_t^{bid} P_t^{bid} + F_t^{ask} P_t^{ask} - fees_t</w:t>
       </w:r>
     </w:p>
     <w:p>
@@ -1902,7 +2475,7 @@
           <w:b/>
           <w:sz w:val="22"/>
         </w:rPr>
-        <w:t>W_t = X_t + q_t S_t</w:t>
+        <w:t>(10)  W_t = X_t + q_t S_t</w:t>
       </w:r>
     </w:p>
     <w:p>
@@ -1920,7 +2493,7 @@
           <w:b/>
           <w:sz w:val="22"/>
         </w:rPr>
-        <w:t>R_t = W_{t+1} - W_t - eta q_{t+1}^2</w:t>
+        <w:t>(11)  R_t = W_{t+1} - W_t - eta q_{t+1}^2</w:t>
       </w:r>
     </w:p>
     <w:p>
@@ -1946,7 +2519,7 @@
           <w:b/>
           <w:sz w:val="22"/>
         </w:rPr>
-        <w:t>r_t = S_t - q_t gamma sigma^2 tau</w:t>
+        <w:t>(12)  r_t = S_t - q_t gamma sigma^2 tau</w:t>
       </w:r>
     </w:p>
     <w:p>
@@ -1964,7 +2537,7 @@
           <w:b/>
           <w:sz w:val="22"/>
         </w:rPr>
-        <w:t>delta_AS = 0.5 gamma sigma^2 tau + (1 / gamma) log(1 + gamma / k)</w:t>
+        <w:t>(13)  delta_AS = 0.5 gamma sigma^2 tau + (1 / gamma) log(1 + gamma / k)</w:t>
       </w:r>
     </w:p>
     <w:p>
@@ -1990,7 +2563,7 @@
           <w:b/>
           <w:sz w:val="22"/>
         </w:rPr>
-        <w:t>rho_t(theta) = pi_theta(a_t | s_t) / pi_theta_old(a_t | s_t)</w:t>
+        <w:t>(14)  rho_t(theta) = pi_theta(a_t | s_t) / pi_theta_old(a_t | s_t)</w:t>
       </w:r>
     </w:p>
     <w:p>
@@ -2008,7 +2581,7 @@
           <w:b/>
           <w:sz w:val="22"/>
         </w:rPr>
-        <w:t>L_CLIP(theta) = E_t[min(rho_t(theta) A_hat_t, clip(rho_t(theta), 1-eps, 1+eps) A_hat_t)]</w:t>
+        <w:t>(15)  L_CLIP(theta) = E_t[min(rho_t(theta) A_hat_t, clip(rho_t(theta), 1-eps, 1+eps) A_hat_t)]</w:t>
       </w:r>
     </w:p>
     <w:p>
@@ -4884,12 +5457,14 @@
     </w:p>
     <w:p>
       <w:pPr>
+        <w:keepNext/>
+        <w:keepLines/>
         <w:jc w:val="center"/>
       </w:pPr>
       <w:r>
         <w:drawing>
           <wp:inline xmlns:a="http://schemas.openxmlformats.org/drawingml/2006/main" xmlns:pic="http://schemas.openxmlformats.org/drawingml/2006/picture">
-            <wp:extent cx="5577840" cy="2185910"/>
+            <wp:extent cx="5257800" cy="2060489"/>
             <wp:docPr id="1" name="Picture 1"/>
             <wp:cNvGraphicFramePr>
               <a:graphicFrameLocks noChangeAspect="1"/>
@@ -4910,7 +5485,7 @@
                   <pic:spPr>
                     <a:xfrm>
                       <a:off x="0" y="0"/>
-                      <a:ext cx="5577840" cy="2185910"/>
+                      <a:ext cx="5257800" cy="2060489"/>
                     </a:xfrm>
                     <a:prstGeom prst="rect"/>
                   </pic:spPr>
@@ -4924,20 +5499,23 @@
     <w:p>
       <w:pPr>
         <w:pStyle w:val="Caption"/>
+        <w:keepLines/>
         <w:jc w:val="center"/>
       </w:pPr>
       <w:r>
-        <w:t>Figure 1. Main OOS performance and inventory risk, reused from frozen thesis figures.</w:t>
+        <w:t>Figure 1. Main WP5 OOS results: PPO variants dominate naive and AS on risk-adjusted performance, while AS carries much larger inventory tail risk.</w:t>
       </w:r>
     </w:p>
     <w:p>
       <w:pPr>
+        <w:keepNext/>
+        <w:keepLines/>
         <w:jc w:val="center"/>
       </w:pPr>
       <w:r>
         <w:drawing>
           <wp:inline xmlns:a="http://schemas.openxmlformats.org/drawingml/2006/main" xmlns:pic="http://schemas.openxmlformats.org/drawingml/2006/picture">
-            <wp:extent cx="5577840" cy="2519585"/>
+            <wp:extent cx="4892040" cy="2209800"/>
             <wp:docPr id="2" name="Picture 2"/>
             <wp:cNvGraphicFramePr>
               <a:graphicFrameLocks noChangeAspect="1"/>
@@ -4958,7 +5536,7 @@
                   <pic:spPr>
                     <a:xfrm>
                       <a:off x="0" y="0"/>
-                      <a:ext cx="5577840" cy="2519585"/>
+                      <a:ext cx="4892040" cy="2209800"/>
                     </a:xfrm>
                     <a:prstGeom prst="rect"/>
                   </pic:spPr>
@@ -4972,12 +5550,19 @@
     <w:p>
       <w:pPr>
         <w:pStyle w:val="Caption"/>
+        <w:keepLines/>
         <w:jc w:val="center"/>
       </w:pPr>
       <w:r>
-        <w:t>Figure 2. Seed-paired PPO-aware versus PPO-blind comparison.</w:t>
+        <w:t>Figure 2. Seed-paired PPO-aware versus PPO-blind comparison: the estimated regime channel does not create a robust Sharpe-like advantage.</w:t>
       </w:r>
     </w:p>
+    <w:p>
+      <w:r>
+        <w:t>The paired-seed view shows that the aware policy does not dominate the blind policy seed by seed. The equity panel even favors the blind policy in the canonical paired test.</w:t>
+      </w:r>
+    </w:p>
+    <w:p/>
     <w:p>
       <w:pPr>
         <w:pStyle w:val="Heading2"/>
@@ -5630,863 +6215,16 @@
         <w:t>The strongest ablation result is that sigma_only has the highest mean Sharpe-like value, while oracle_full does not significantly beat it. TOST supports practical equivalence under the +/-0.10 Sharpe-like bound.</w:t>
       </w:r>
     </w:p>
-    <w:tbl>
-      <w:tblPr>
-        <w:tblStyle w:val="TableGrid"/>
-        <w:tblW w:type="dxa" w:w="9360"/>
-        <w:tblLook w:firstColumn="1" w:firstRow="1" w:lastColumn="0" w:lastRow="0" w:noHBand="0" w:noVBand="1" w:val="04A0"/>
-        <w:tblInd w:w="120" w:type="dxa"/>
-        <w:tblLayout w:type="fixed"/>
-      </w:tblPr>
-      <w:tblGrid>
-        <w:gridCol w:w="2400"/>
-        <w:gridCol w:w="2100"/>
-        <w:gridCol w:w="2300"/>
-        <w:gridCol w:w="2560"/>
-      </w:tblGrid>
-      <w:tr>
-        <w:tc>
-          <w:tcPr>
-            <w:tcW w:type="dxa" w:w="2400"/>
-            <w:shd w:fill="F2F4F7"/>
-            <w:vAlign w:val="center"/>
-            <w:tcMar>
-              <w:top w:w="80" w:type="dxa"/>
-              <w:start w:w="120" w:type="dxa"/>
-              <w:bottom w:w="80" w:type="dxa"/>
-              <w:end w:w="120" w:type="dxa"/>
-            </w:tcMar>
-          </w:tcPr>
-          <w:p>
-            <w:r>
-              <w:rPr>
-                <w:b/>
-                <w:sz w:val="18"/>
-              </w:rPr>
-              <w:t>Comparison</w:t>
-            </w:r>
-          </w:p>
-        </w:tc>
-        <w:tc>
-          <w:tcPr>
-            <w:tcW w:type="dxa" w:w="2100"/>
-            <w:shd w:fill="F2F4F7"/>
-            <w:vAlign w:val="center"/>
-            <w:tcMar>
-              <w:top w:w="80" w:type="dxa"/>
-              <w:start w:w="120" w:type="dxa"/>
-              <w:bottom w:w="80" w:type="dxa"/>
-              <w:end w:w="120" w:type="dxa"/>
-            </w:tcMar>
-          </w:tcPr>
-          <w:p>
-            <w:r>
-              <w:rPr>
-                <w:b/>
-                <w:sz w:val="18"/>
-              </w:rPr>
-              <w:t>Metric or test</w:t>
-            </w:r>
-          </w:p>
-        </w:tc>
-        <w:tc>
-          <w:tcPr>
-            <w:tcW w:type="dxa" w:w="2300"/>
-            <w:shd w:fill="F2F4F7"/>
-            <w:vAlign w:val="center"/>
-            <w:tcMar>
-              <w:top w:w="80" w:type="dxa"/>
-              <w:start w:w="120" w:type="dxa"/>
-              <w:bottom w:w="80" w:type="dxa"/>
-              <w:end w:w="120" w:type="dxa"/>
-            </w:tcMar>
-          </w:tcPr>
-          <w:p>
-            <w:r>
-              <w:rPr>
-                <w:b/>
-                <w:sz w:val="18"/>
-              </w:rPr>
-              <w:t>Canonical result</w:t>
-            </w:r>
-          </w:p>
-        </w:tc>
-        <w:tc>
-          <w:tcPr>
-            <w:tcW w:type="dxa" w:w="2560"/>
-            <w:shd w:fill="F2F4F7"/>
-            <w:vAlign w:val="center"/>
-            <w:tcMar>
-              <w:top w:w="80" w:type="dxa"/>
-              <w:start w:w="120" w:type="dxa"/>
-              <w:bottom w:w="80" w:type="dxa"/>
-              <w:end w:w="120" w:type="dxa"/>
-            </w:tcMar>
-          </w:tcPr>
-          <w:p>
-            <w:r>
-              <w:rPr>
-                <w:b/>
-                <w:sz w:val="18"/>
-              </w:rPr>
-              <w:t>Defense-safe reading</w:t>
-            </w:r>
-          </w:p>
-        </w:tc>
-      </w:tr>
-      <w:tr>
-        <w:tc>
-          <w:tcPr>
-            <w:tcW w:type="dxa" w:w="2400"/>
-            <w:vAlign w:val="center"/>
-            <w:tcMar>
-              <w:top w:w="80" w:type="dxa"/>
-              <w:start w:w="120" w:type="dxa"/>
-              <w:bottom w:w="80" w:type="dxa"/>
-              <w:end w:w="120" w:type="dxa"/>
-            </w:tcMar>
-          </w:tcPr>
-          <w:p>
-            <w:r>
-              <w:rPr>
-                <w:sz w:val="18"/>
-              </w:rPr>
-              <w:t>PPO-aware vs PPO-blind</w:t>
-            </w:r>
-          </w:p>
-        </w:tc>
-        <w:tc>
-          <w:tcPr>
-            <w:tcW w:type="dxa" w:w="2100"/>
-            <w:vAlign w:val="center"/>
-            <w:tcMar>
-              <w:top w:w="80" w:type="dxa"/>
-              <w:start w:w="120" w:type="dxa"/>
-              <w:bottom w:w="80" w:type="dxa"/>
-              <w:end w:w="120" w:type="dxa"/>
-            </w:tcMar>
-          </w:tcPr>
-          <w:p>
-            <w:r>
-              <w:rPr>
-                <w:sz w:val="18"/>
-              </w:rPr>
-              <w:t>Sharpe-like paired t-test</w:t>
-            </w:r>
-          </w:p>
-        </w:tc>
-        <w:tc>
-          <w:tcPr>
-            <w:tcW w:type="dxa" w:w="2300"/>
-            <w:vAlign w:val="center"/>
-            <w:tcMar>
-              <w:top w:w="80" w:type="dxa"/>
-              <w:start w:w="120" w:type="dxa"/>
-              <w:bottom w:w="80" w:type="dxa"/>
-              <w:end w:w="120" w:type="dxa"/>
-            </w:tcMar>
-          </w:tcPr>
-          <w:p>
-            <w:r>
-              <w:rPr>
-                <w:sz w:val="18"/>
-              </w:rPr>
-              <w:t>p = 0.261</w:t>
-            </w:r>
-          </w:p>
-        </w:tc>
-        <w:tc>
-          <w:tcPr>
-            <w:tcW w:type="dxa" w:w="2560"/>
-            <w:vAlign w:val="center"/>
-            <w:tcMar>
-              <w:top w:w="80" w:type="dxa"/>
-              <w:start w:w="120" w:type="dxa"/>
-              <w:bottom w:w="80" w:type="dxa"/>
-              <w:end w:w="120" w:type="dxa"/>
-            </w:tcMar>
-          </w:tcPr>
-          <w:p>
-            <w:r>
-              <w:rPr>
-                <w:sz w:val="18"/>
-              </w:rPr>
-              <w:t>No significant Sharpe improvement from explicit regime labels.</w:t>
-            </w:r>
-          </w:p>
-        </w:tc>
-      </w:tr>
-      <w:tr>
-        <w:tc>
-          <w:tcPr>
-            <w:tcW w:type="dxa" w:w="2400"/>
-            <w:vAlign w:val="center"/>
-            <w:tcMar>
-              <w:top w:w="80" w:type="dxa"/>
-              <w:start w:w="120" w:type="dxa"/>
-              <w:bottom w:w="80" w:type="dxa"/>
-              <w:end w:w="120" w:type="dxa"/>
-            </w:tcMar>
-          </w:tcPr>
-          <w:p>
-            <w:r>
-              <w:rPr>
-                <w:sz w:val="18"/>
-              </w:rPr>
-              <w:t>PPO-aware vs PPO-blind</w:t>
-            </w:r>
-          </w:p>
-        </w:tc>
-        <w:tc>
-          <w:tcPr>
-            <w:tcW w:type="dxa" w:w="2100"/>
-            <w:vAlign w:val="center"/>
-            <w:tcMar>
-              <w:top w:w="80" w:type="dxa"/>
-              <w:start w:w="120" w:type="dxa"/>
-              <w:bottom w:w="80" w:type="dxa"/>
-              <w:end w:w="120" w:type="dxa"/>
-            </w:tcMar>
-          </w:tcPr>
-          <w:p>
-            <w:r>
-              <w:rPr>
-                <w:sz w:val="18"/>
-              </w:rPr>
-              <w:t>Final equity paired t-test</w:t>
-            </w:r>
-          </w:p>
-        </w:tc>
-        <w:tc>
-          <w:tcPr>
-            <w:tcW w:type="dxa" w:w="2300"/>
-            <w:vAlign w:val="center"/>
-            <w:tcMar>
-              <w:top w:w="80" w:type="dxa"/>
-              <w:start w:w="120" w:type="dxa"/>
-              <w:bottom w:w="80" w:type="dxa"/>
-              <w:end w:w="120" w:type="dxa"/>
-            </w:tcMar>
-          </w:tcPr>
-          <w:p>
-            <w:r>
-              <w:rPr>
-                <w:sz w:val="18"/>
-              </w:rPr>
-              <w:t>p = 0.023</w:t>
-            </w:r>
-          </w:p>
-        </w:tc>
-        <w:tc>
-          <w:tcPr>
-            <w:tcW w:type="dxa" w:w="2560"/>
-            <w:vAlign w:val="center"/>
-            <w:tcMar>
-              <w:top w:w="80" w:type="dxa"/>
-              <w:start w:w="120" w:type="dxa"/>
-              <w:bottom w:w="80" w:type="dxa"/>
-              <w:end w:w="120" w:type="dxa"/>
-            </w:tcMar>
-          </w:tcPr>
-          <w:p>
-            <w:r>
-              <w:rPr>
-                <w:sz w:val="18"/>
-              </w:rPr>
-              <w:t>Final equity favors PPO-blind.</w:t>
-            </w:r>
-          </w:p>
-        </w:tc>
-      </w:tr>
-      <w:tr>
-        <w:tc>
-          <w:tcPr>
-            <w:tcW w:type="dxa" w:w="2400"/>
-            <w:vAlign w:val="center"/>
-            <w:tcMar>
-              <w:top w:w="80" w:type="dxa"/>
-              <w:start w:w="120" w:type="dxa"/>
-              <w:bottom w:w="80" w:type="dxa"/>
-              <w:end w:w="120" w:type="dxa"/>
-            </w:tcMar>
-          </w:tcPr>
-          <w:p>
-            <w:r>
-              <w:rPr>
-                <w:sz w:val="18"/>
-              </w:rPr>
-              <w:t>ppo_sigma_only vs ppo_oracle_full</w:t>
-            </w:r>
-          </w:p>
-        </w:tc>
-        <w:tc>
-          <w:tcPr>
-            <w:tcW w:type="dxa" w:w="2100"/>
-            <w:vAlign w:val="center"/>
-            <w:tcMar>
-              <w:top w:w="80" w:type="dxa"/>
-              <w:start w:w="120" w:type="dxa"/>
-              <w:bottom w:w="80" w:type="dxa"/>
-              <w:end w:w="120" w:type="dxa"/>
-            </w:tcMar>
-          </w:tcPr>
-          <w:p>
-            <w:r>
-              <w:rPr>
-                <w:sz w:val="18"/>
-              </w:rPr>
-              <w:t>Sharpe-like paired t-test</w:t>
-            </w:r>
-          </w:p>
-        </w:tc>
-        <w:tc>
-          <w:tcPr>
-            <w:tcW w:type="dxa" w:w="2300"/>
-            <w:vAlign w:val="center"/>
-            <w:tcMar>
-              <w:top w:w="80" w:type="dxa"/>
-              <w:start w:w="120" w:type="dxa"/>
-              <w:bottom w:w="80" w:type="dxa"/>
-              <w:end w:w="120" w:type="dxa"/>
-            </w:tcMar>
-          </w:tcPr>
-          <w:p>
-            <w:r>
-              <w:rPr>
-                <w:sz w:val="18"/>
-              </w:rPr>
-              <w:t>p = 0.115</w:t>
-            </w:r>
-          </w:p>
-        </w:tc>
-        <w:tc>
-          <w:tcPr>
-            <w:tcW w:type="dxa" w:w="2560"/>
-            <w:vAlign w:val="center"/>
-            <w:tcMar>
-              <w:top w:w="80" w:type="dxa"/>
-              <w:start w:w="120" w:type="dxa"/>
-              <w:bottom w:w="80" w:type="dxa"/>
-              <w:end w:w="120" w:type="dxa"/>
-            </w:tcMar>
-          </w:tcPr>
-          <w:p>
-            <w:r>
-              <w:rPr>
-                <w:sz w:val="18"/>
-              </w:rPr>
-              <w:t>No significant oracle-label Sharpe improvement over sigma_hat alone.</w:t>
-            </w:r>
-          </w:p>
-        </w:tc>
-      </w:tr>
-      <w:tr>
-        <w:tc>
-          <w:tcPr>
-            <w:tcW w:type="dxa" w:w="2400"/>
-            <w:vAlign w:val="center"/>
-            <w:tcMar>
-              <w:top w:w="80" w:type="dxa"/>
-              <w:start w:w="120" w:type="dxa"/>
-              <w:bottom w:w="80" w:type="dxa"/>
-              <w:end w:w="120" w:type="dxa"/>
-            </w:tcMar>
-          </w:tcPr>
-          <w:p>
-            <w:r>
-              <w:rPr>
-                <w:sz w:val="18"/>
-              </w:rPr>
-              <w:t>ppo_sigma_only vs ppo_oracle_full</w:t>
-            </w:r>
-          </w:p>
-        </w:tc>
-        <w:tc>
-          <w:tcPr>
-            <w:tcW w:type="dxa" w:w="2100"/>
-            <w:vAlign w:val="center"/>
-            <w:tcMar>
-              <w:top w:w="80" w:type="dxa"/>
-              <w:start w:w="120" w:type="dxa"/>
-              <w:bottom w:w="80" w:type="dxa"/>
-              <w:end w:w="120" w:type="dxa"/>
-            </w:tcMar>
-          </w:tcPr>
-          <w:p>
-            <w:r>
-              <w:rPr>
-                <w:sz w:val="18"/>
-              </w:rPr>
-              <w:t>TOST +/-0.10</w:t>
-            </w:r>
-          </w:p>
-        </w:tc>
-        <w:tc>
-          <w:tcPr>
-            <w:tcW w:type="dxa" w:w="2300"/>
-            <w:vAlign w:val="center"/>
-            <w:tcMar>
-              <w:top w:w="80" w:type="dxa"/>
-              <w:start w:w="120" w:type="dxa"/>
-              <w:bottom w:w="80" w:type="dxa"/>
-              <w:end w:w="120" w:type="dxa"/>
-            </w:tcMar>
-          </w:tcPr>
-          <w:p>
-            <w:r>
-              <w:rPr>
-                <w:sz w:val="18"/>
-              </w:rPr>
-              <w:t>p = 0.00067; 90% CI [-0.001, +0.063]</w:t>
-            </w:r>
-          </w:p>
-        </w:tc>
-        <w:tc>
-          <w:tcPr>
-            <w:tcW w:type="dxa" w:w="2560"/>
-            <w:vAlign w:val="center"/>
-            <w:tcMar>
-              <w:top w:w="80" w:type="dxa"/>
-              <w:start w:w="120" w:type="dxa"/>
-              <w:bottom w:w="80" w:type="dxa"/>
-              <w:end w:w="120" w:type="dxa"/>
-            </w:tcMar>
-          </w:tcPr>
-          <w:p>
-            <w:r>
-              <w:rPr>
-                <w:sz w:val="18"/>
-              </w:rPr>
-              <w:t>Positive evidence of practical equivalence under the stated bound.</w:t>
-            </w:r>
-          </w:p>
-        </w:tc>
-      </w:tr>
-      <w:tr>
-        <w:tc>
-          <w:tcPr>
-            <w:tcW w:type="dxa" w:w="2400"/>
-            <w:vAlign w:val="center"/>
-            <w:tcMar>
-              <w:top w:w="80" w:type="dxa"/>
-              <w:start w:w="120" w:type="dxa"/>
-              <w:bottom w:w="80" w:type="dxa"/>
-              <w:end w:w="120" w:type="dxa"/>
-            </w:tcMar>
-          </w:tcPr>
-          <w:p>
-            <w:r>
-              <w:rPr>
-                <w:sz w:val="18"/>
-              </w:rPr>
-              <w:t>HMM detector</w:t>
-            </w:r>
-          </w:p>
-        </w:tc>
-        <w:tc>
-          <w:tcPr>
-            <w:tcW w:type="dxa" w:w="2100"/>
-            <w:vAlign w:val="center"/>
-            <w:tcMar>
-              <w:top w:w="80" w:type="dxa"/>
-              <w:start w:w="120" w:type="dxa"/>
-              <w:bottom w:w="80" w:type="dxa"/>
-              <w:end w:w="120" w:type="dxa"/>
-            </w:tcMar>
-          </w:tcPr>
-          <w:p>
-            <w:r>
-              <w:rPr>
-                <w:sz w:val="18"/>
-              </w:rPr>
-              <w:t>Detector accuracy</w:t>
-            </w:r>
-          </w:p>
-        </w:tc>
-        <w:tc>
-          <w:tcPr>
-            <w:tcW w:type="dxa" w:w="2300"/>
-            <w:vAlign w:val="center"/>
-            <w:tcMar>
-              <w:top w:w="80" w:type="dxa"/>
-              <w:start w:w="120" w:type="dxa"/>
-              <w:bottom w:w="80" w:type="dxa"/>
-              <w:end w:w="120" w:type="dxa"/>
-            </w:tcMar>
-          </w:tcPr>
-          <w:p>
-            <w:r>
-              <w:rPr>
-                <w:sz w:val="18"/>
-              </w:rPr>
-              <w:t>81.8%</w:t>
-            </w:r>
-          </w:p>
-        </w:tc>
-        <w:tc>
-          <w:tcPr>
-            <w:tcW w:type="dxa" w:w="2560"/>
-            <w:vAlign w:val="center"/>
-            <w:tcMar>
-              <w:top w:w="80" w:type="dxa"/>
-              <w:start w:w="120" w:type="dxa"/>
-              <w:bottom w:w="80" w:type="dxa"/>
-              <w:end w:w="120" w:type="dxa"/>
-            </w:tcMar>
-          </w:tcPr>
-          <w:p>
-            <w:r>
-              <w:rPr>
-                <w:sz w:val="18"/>
-              </w:rPr>
-              <w:t>Higher detector accuracy still does not create a reliable PPO advantage.</w:t>
-            </w:r>
-          </w:p>
-        </w:tc>
-      </w:tr>
-      <w:tr>
-        <w:tc>
-          <w:tcPr>
-            <w:tcW w:type="dxa" w:w="2400"/>
-            <w:vAlign w:val="center"/>
-            <w:tcMar>
-              <w:top w:w="80" w:type="dxa"/>
-              <w:start w:w="120" w:type="dxa"/>
-              <w:bottom w:w="80" w:type="dxa"/>
-              <w:end w:w="120" w:type="dxa"/>
-            </w:tcMar>
-          </w:tcPr>
-          <w:p>
-            <w:r>
-              <w:rPr>
-                <w:sz w:val="18"/>
-              </w:rPr>
-              <w:t>Detector robustness</w:t>
-            </w:r>
-          </w:p>
-        </w:tc>
-        <w:tc>
-          <w:tcPr>
-            <w:tcW w:type="dxa" w:w="2100"/>
-            <w:vAlign w:val="center"/>
-            <w:tcMar>
-              <w:top w:w="80" w:type="dxa"/>
-              <w:start w:w="120" w:type="dxa"/>
-              <w:bottom w:w="80" w:type="dxa"/>
-              <w:end w:w="120" w:type="dxa"/>
-            </w:tcMar>
-          </w:tcPr>
-          <w:p>
-            <w:r>
-              <w:rPr>
-                <w:sz w:val="18"/>
-              </w:rPr>
-              <w:t>ANOVA</w:t>
-            </w:r>
-          </w:p>
-        </w:tc>
-        <w:tc>
-          <w:tcPr>
-            <w:tcW w:type="dxa" w:w="2300"/>
-            <w:vAlign w:val="center"/>
-            <w:tcMar>
-              <w:top w:w="80" w:type="dxa"/>
-              <w:start w:w="120" w:type="dxa"/>
-              <w:bottom w:w="80" w:type="dxa"/>
-              <w:end w:w="120" w:type="dxa"/>
-            </w:tcMar>
-          </w:tcPr>
-          <w:p>
-            <w:r>
-              <w:rPr>
-                <w:sz w:val="18"/>
-              </w:rPr>
-              <w:t>p = 0.997</w:t>
-            </w:r>
-          </w:p>
-        </w:tc>
-        <w:tc>
-          <w:tcPr>
-            <w:tcW w:type="dxa" w:w="2560"/>
-            <w:vAlign w:val="center"/>
-            <w:tcMar>
-              <w:top w:w="80" w:type="dxa"/>
-              <w:start w:w="120" w:type="dxa"/>
-              <w:bottom w:w="80" w:type="dxa"/>
-              <w:end w:w="120" w:type="dxa"/>
-            </w:tcMar>
-          </w:tcPr>
-          <w:p>
-            <w:r>
-              <w:rPr>
-                <w:sz w:val="18"/>
-              </w:rPr>
-              <w:t>Detector choice does not explain the null result.</w:t>
-            </w:r>
-          </w:p>
-        </w:tc>
-      </w:tr>
-      <w:tr>
-        <w:tc>
-          <w:tcPr>
-            <w:tcW w:type="dxa" w:w="2400"/>
-            <w:vAlign w:val="center"/>
-            <w:tcMar>
-              <w:top w:w="80" w:type="dxa"/>
-              <w:start w:w="120" w:type="dxa"/>
-              <w:bottom w:w="80" w:type="dxa"/>
-              <w:end w:w="120" w:type="dxa"/>
-            </w:tcMar>
-          </w:tcPr>
-          <w:p>
-            <w:r>
-              <w:rPr>
-                <w:sz w:val="18"/>
-              </w:rPr>
-              <w:t>Regime-conditional eta</w:t>
-            </w:r>
-          </w:p>
-        </w:tc>
-        <w:tc>
-          <w:tcPr>
-            <w:tcW w:type="dxa" w:w="2100"/>
-            <w:vAlign w:val="center"/>
-            <w:tcMar>
-              <w:top w:w="80" w:type="dxa"/>
-              <w:start w:w="120" w:type="dxa"/>
-              <w:bottom w:w="80" w:type="dxa"/>
-              <w:end w:w="120" w:type="dxa"/>
-            </w:tcMar>
-          </w:tcPr>
-          <w:p>
-            <w:r>
-              <w:rPr>
-                <w:sz w:val="18"/>
-              </w:rPr>
-              <w:t>sigma_only vs combined Sharpe</w:t>
-            </w:r>
-          </w:p>
-        </w:tc>
-        <w:tc>
-          <w:tcPr>
-            <w:tcW w:type="dxa" w:w="2300"/>
-            <w:vAlign w:val="center"/>
-            <w:tcMar>
-              <w:top w:w="80" w:type="dxa"/>
-              <w:start w:w="120" w:type="dxa"/>
-              <w:bottom w:w="80" w:type="dxa"/>
-              <w:end w:w="120" w:type="dxa"/>
-            </w:tcMar>
-          </w:tcPr>
-          <w:p>
-            <w:r>
-              <w:rPr>
-                <w:sz w:val="18"/>
-              </w:rPr>
-              <w:t>p = 0.0016</w:t>
-            </w:r>
-          </w:p>
-        </w:tc>
-        <w:tc>
-          <w:tcPr>
-            <w:tcW w:type="dxa" w:w="2560"/>
-            <w:vAlign w:val="center"/>
-            <w:tcMar>
-              <w:top w:w="80" w:type="dxa"/>
-              <w:start w:w="120" w:type="dxa"/>
-              <w:bottom w:w="80" w:type="dxa"/>
-              <w:end w:w="120" w:type="dxa"/>
-            </w:tcMar>
-          </w:tcPr>
-          <w:p>
-            <w:r>
-              <w:rPr>
-                <w:sz w:val="18"/>
-              </w:rPr>
-              <w:t>Result favors sigma_only.</w:t>
-            </w:r>
-          </w:p>
-        </w:tc>
-      </w:tr>
-      <w:tr>
-        <w:tc>
-          <w:tcPr>
-            <w:tcW w:type="dxa" w:w="2400"/>
-            <w:vAlign w:val="center"/>
-            <w:tcMar>
-              <w:top w:w="80" w:type="dxa"/>
-              <w:start w:w="120" w:type="dxa"/>
-              <w:bottom w:w="80" w:type="dxa"/>
-              <w:end w:w="120" w:type="dxa"/>
-            </w:tcMar>
-          </w:tcPr>
-          <w:p>
-            <w:r>
-              <w:rPr>
-                <w:sz w:val="18"/>
-              </w:rPr>
-              <w:t>Mild misspecification</w:t>
-            </w:r>
-          </w:p>
-        </w:tc>
-        <w:tc>
-          <w:tcPr>
-            <w:tcW w:type="dxa" w:w="2100"/>
-            <w:vAlign w:val="center"/>
-            <w:tcMar>
-              <w:top w:w="80" w:type="dxa"/>
-              <w:start w:w="120" w:type="dxa"/>
-              <w:bottom w:w="80" w:type="dxa"/>
-              <w:end w:w="120" w:type="dxa"/>
-            </w:tcMar>
-          </w:tcPr>
-          <w:p>
-            <w:r>
-              <w:rPr>
-                <w:sz w:val="18"/>
-              </w:rPr>
-              <w:t>sigma_only vs oracle_full Sharpe t-test</w:t>
-            </w:r>
-          </w:p>
-        </w:tc>
-        <w:tc>
-          <w:tcPr>
-            <w:tcW w:type="dxa" w:w="2300"/>
-            <w:vAlign w:val="center"/>
-            <w:tcMar>
-              <w:top w:w="80" w:type="dxa"/>
-              <w:start w:w="120" w:type="dxa"/>
-              <w:bottom w:w="80" w:type="dxa"/>
-              <w:end w:w="120" w:type="dxa"/>
-            </w:tcMar>
-          </w:tcPr>
-          <w:p>
-            <w:r>
-              <w:rPr>
-                <w:sz w:val="18"/>
-              </w:rPr>
-              <w:t>p = 0.881</w:t>
-            </w:r>
-          </w:p>
-        </w:tc>
-        <w:tc>
-          <w:tcPr>
-            <w:tcW w:type="dxa" w:w="2560"/>
-            <w:vAlign w:val="center"/>
-            <w:tcMar>
-              <w:top w:w="80" w:type="dxa"/>
-              <w:start w:w="120" w:type="dxa"/>
-              <w:bottom w:w="80" w:type="dxa"/>
-              <w:end w:w="120" w:type="dxa"/>
-            </w:tcMar>
-          </w:tcPr>
-          <w:p>
-            <w:r>
-              <w:rPr>
-                <w:sz w:val="18"/>
-              </w:rPr>
-              <w:t>No significant Sharpe difference.</w:t>
-            </w:r>
-          </w:p>
-        </w:tc>
-      </w:tr>
-      <w:tr>
-        <w:tc>
-          <w:tcPr>
-            <w:tcW w:type="dxa" w:w="2400"/>
-            <w:vAlign w:val="center"/>
-            <w:tcMar>
-              <w:top w:w="80" w:type="dxa"/>
-              <w:start w:w="120" w:type="dxa"/>
-              <w:bottom w:w="80" w:type="dxa"/>
-              <w:end w:w="120" w:type="dxa"/>
-            </w:tcMar>
-          </w:tcPr>
-          <w:p>
-            <w:r>
-              <w:rPr>
-                <w:sz w:val="18"/>
-              </w:rPr>
-              <w:t>Mild misspecification</w:t>
-            </w:r>
-          </w:p>
-        </w:tc>
-        <w:tc>
-          <w:tcPr>
-            <w:tcW w:type="dxa" w:w="2100"/>
-            <w:vAlign w:val="center"/>
-            <w:tcMar>
-              <w:top w:w="80" w:type="dxa"/>
-              <w:start w:w="120" w:type="dxa"/>
-              <w:bottom w:w="80" w:type="dxa"/>
-              <w:end w:w="120" w:type="dxa"/>
-            </w:tcMar>
-          </w:tcPr>
-          <w:p>
-            <w:r>
-              <w:rPr>
-                <w:sz w:val="18"/>
-              </w:rPr>
-              <w:t>TOST +/-0.05</w:t>
-            </w:r>
-          </w:p>
-        </w:tc>
-        <w:tc>
-          <w:tcPr>
-            <w:tcW w:type="dxa" w:w="2300"/>
-            <w:vAlign w:val="center"/>
-            <w:tcMar>
-              <w:top w:w="80" w:type="dxa"/>
-              <w:start w:w="120" w:type="dxa"/>
-              <w:bottom w:w="80" w:type="dxa"/>
-              <w:end w:w="120" w:type="dxa"/>
-            </w:tcMar>
-          </w:tcPr>
-          <w:p>
-            <w:r>
-              <w:rPr>
-                <w:sz w:val="18"/>
-              </w:rPr>
-              <w:t>p = 0.042</w:t>
-            </w:r>
-          </w:p>
-        </w:tc>
-        <w:tc>
-          <w:tcPr>
-            <w:tcW w:type="dxa" w:w="2560"/>
-            <w:vAlign w:val="center"/>
-            <w:tcMar>
-              <w:top w:w="80" w:type="dxa"/>
-              <w:start w:w="120" w:type="dxa"/>
-              <w:bottom w:w="80" w:type="dxa"/>
-              <w:end w:w="120" w:type="dxa"/>
-            </w:tcMar>
-          </w:tcPr>
-          <w:p>
-            <w:r>
-              <w:rPr>
-                <w:sz w:val="18"/>
-              </w:rPr>
-              <w:t>Practical equivalence is supported under the stated bound.</w:t>
-            </w:r>
-          </w:p>
-        </w:tc>
-      </w:tr>
-    </w:tbl>
-    <w:p/>
-    <w:p>
-      <w:r>
-        <w:t>The t-test results show no significant Sharpe improvement from explicit regime labels, while the TOST result provides positive evidence of practical equivalence under the stated bound.</w:t>
-      </w:r>
-    </w:p>
     <w:p>
       <w:pPr>
+        <w:keepNext/>
+        <w:keepLines/>
         <w:jc w:val="center"/>
       </w:pPr>
       <w:r>
         <w:drawing>
           <wp:inline xmlns:a="http://schemas.openxmlformats.org/drawingml/2006/main" xmlns:pic="http://schemas.openxmlformats.org/drawingml/2006/picture">
-            <wp:extent cx="5577840" cy="1735259"/>
+            <wp:extent cx="4754880" cy="1479237"/>
             <wp:docPr id="3" name="Picture 3"/>
             <wp:cNvGraphicFramePr>
               <a:graphicFrameLocks noChangeAspect="1"/>
@@ -6507,7 +6245,7 @@
                   <pic:spPr>
                     <a:xfrm>
                       <a:off x="0" y="0"/>
-                      <a:ext cx="5577840" cy="1735259"/>
+                      <a:ext cx="4754880" cy="1479237"/>
                     </a:xfrm>
                     <a:prstGeom prst="rect"/>
                   </pic:spPr>
@@ -6521,20 +6259,23 @@
     <w:p>
       <w:pPr>
         <w:pStyle w:val="Caption"/>
+        <w:keepLines/>
         <w:jc w:val="center"/>
       </w:pPr>
       <w:r>
-        <w:t>Figure 3. Five-variant ablation summary.</w:t>
+        <w:t>Figure 3. Five-variant ablation summary: sigma_only is the strongest mean Sharpe-like variant, and adding categorical labels does not improve it.</w:t>
       </w:r>
     </w:p>
     <w:p>
       <w:pPr>
+        <w:keepNext/>
+        <w:keepLines/>
         <w:jc w:val="center"/>
       </w:pPr>
       <w:r>
         <w:drawing>
           <wp:inline xmlns:a="http://schemas.openxmlformats.org/drawingml/2006/main" xmlns:pic="http://schemas.openxmlformats.org/drawingml/2006/picture">
-            <wp:extent cx="5577840" cy="2664682"/>
+            <wp:extent cx="4754880" cy="2271533"/>
             <wp:docPr id="4" name="Picture 4"/>
             <wp:cNvGraphicFramePr>
               <a:graphicFrameLocks noChangeAspect="1"/>
@@ -6555,7 +6296,7 @@
                   <pic:spPr>
                     <a:xfrm>
                       <a:off x="0" y="0"/>
-                      <a:ext cx="5577840" cy="2664682"/>
+                      <a:ext cx="4754880" cy="2271533"/>
                     </a:xfrm>
                     <a:prstGeom prst="rect"/>
                   </pic:spPr>
@@ -6569,10 +6310,870 @@
     <w:p>
       <w:pPr>
         <w:pStyle w:val="Caption"/>
+        <w:keepLines/>
         <w:jc w:val="center"/>
       </w:pPr>
       <w:r>
-        <w:t>Figure 4. Oracle-label paired-seed comparison.</w:t>
+        <w:t>Figure 4. Oracle-label paired-seed comparison: even true regime labels do not reliably improve on sigma_hat alone.</w:t>
+      </w:r>
+    </w:p>
+    <w:p>
+      <w:r>
+        <w:br w:type="page"/>
+      </w:r>
+    </w:p>
+    <w:p>
+      <w:r>
+        <w:t>The compact statistical summary below collects the canonical paired tests used to interpret the ablation and robustness results.</w:t>
+      </w:r>
+    </w:p>
+    <w:tbl>
+      <w:tblPr>
+        <w:tblStyle w:val="TableGrid"/>
+        <w:tblW w:type="dxa" w:w="9360"/>
+        <w:tblLook w:firstColumn="1" w:firstRow="1" w:lastColumn="0" w:lastRow="0" w:noHBand="0" w:noVBand="1" w:val="04A0"/>
+        <w:tblInd w:w="120" w:type="dxa"/>
+        <w:tblLayout w:type="fixed"/>
+      </w:tblPr>
+      <w:tblGrid>
+        <w:gridCol w:w="2400"/>
+        <w:gridCol w:w="2100"/>
+        <w:gridCol w:w="2300"/>
+        <w:gridCol w:w="2560"/>
+      </w:tblGrid>
+      <w:tr>
+        <w:tc>
+          <w:tcPr>
+            <w:tcW w:type="dxa" w:w="2400"/>
+            <w:shd w:fill="F2F4F7"/>
+            <w:vAlign w:val="center"/>
+            <w:tcMar>
+              <w:top w:w="80" w:type="dxa"/>
+              <w:start w:w="120" w:type="dxa"/>
+              <w:bottom w:w="80" w:type="dxa"/>
+              <w:end w:w="120" w:type="dxa"/>
+            </w:tcMar>
+          </w:tcPr>
+          <w:p>
+            <w:r>
+              <w:rPr>
+                <w:b/>
+                <w:sz w:val="18"/>
+              </w:rPr>
+              <w:t>Comparison</w:t>
+            </w:r>
+          </w:p>
+        </w:tc>
+        <w:tc>
+          <w:tcPr>
+            <w:tcW w:type="dxa" w:w="2100"/>
+            <w:shd w:fill="F2F4F7"/>
+            <w:vAlign w:val="center"/>
+            <w:tcMar>
+              <w:top w:w="80" w:type="dxa"/>
+              <w:start w:w="120" w:type="dxa"/>
+              <w:bottom w:w="80" w:type="dxa"/>
+              <w:end w:w="120" w:type="dxa"/>
+            </w:tcMar>
+          </w:tcPr>
+          <w:p>
+            <w:r>
+              <w:rPr>
+                <w:b/>
+                <w:sz w:val="18"/>
+              </w:rPr>
+              <w:t>Metric or test</w:t>
+            </w:r>
+          </w:p>
+        </w:tc>
+        <w:tc>
+          <w:tcPr>
+            <w:tcW w:type="dxa" w:w="2300"/>
+            <w:shd w:fill="F2F4F7"/>
+            <w:vAlign w:val="center"/>
+            <w:tcMar>
+              <w:top w:w="80" w:type="dxa"/>
+              <w:start w:w="120" w:type="dxa"/>
+              <w:bottom w:w="80" w:type="dxa"/>
+              <w:end w:w="120" w:type="dxa"/>
+            </w:tcMar>
+          </w:tcPr>
+          <w:p>
+            <w:r>
+              <w:rPr>
+                <w:b/>
+                <w:sz w:val="18"/>
+              </w:rPr>
+              <w:t>Canonical result</w:t>
+            </w:r>
+          </w:p>
+        </w:tc>
+        <w:tc>
+          <w:tcPr>
+            <w:tcW w:type="dxa" w:w="2560"/>
+            <w:shd w:fill="F2F4F7"/>
+            <w:vAlign w:val="center"/>
+            <w:tcMar>
+              <w:top w:w="80" w:type="dxa"/>
+              <w:start w:w="120" w:type="dxa"/>
+              <w:bottom w:w="80" w:type="dxa"/>
+              <w:end w:w="120" w:type="dxa"/>
+            </w:tcMar>
+          </w:tcPr>
+          <w:p>
+            <w:r>
+              <w:rPr>
+                <w:b/>
+                <w:sz w:val="18"/>
+              </w:rPr>
+              <w:t>Defense-safe reading</w:t>
+            </w:r>
+          </w:p>
+        </w:tc>
+      </w:tr>
+      <w:tr>
+        <w:tc>
+          <w:tcPr>
+            <w:tcW w:type="dxa" w:w="2400"/>
+            <w:vAlign w:val="center"/>
+            <w:tcMar>
+              <w:top w:w="80" w:type="dxa"/>
+              <w:start w:w="120" w:type="dxa"/>
+              <w:bottom w:w="80" w:type="dxa"/>
+              <w:end w:w="120" w:type="dxa"/>
+            </w:tcMar>
+          </w:tcPr>
+          <w:p>
+            <w:r>
+              <w:rPr>
+                <w:sz w:val="18"/>
+              </w:rPr>
+              <w:t>PPO-aware vs PPO-blind</w:t>
+            </w:r>
+          </w:p>
+        </w:tc>
+        <w:tc>
+          <w:tcPr>
+            <w:tcW w:type="dxa" w:w="2100"/>
+            <w:vAlign w:val="center"/>
+            <w:tcMar>
+              <w:top w:w="80" w:type="dxa"/>
+              <w:start w:w="120" w:type="dxa"/>
+              <w:bottom w:w="80" w:type="dxa"/>
+              <w:end w:w="120" w:type="dxa"/>
+            </w:tcMar>
+          </w:tcPr>
+          <w:p>
+            <w:r>
+              <w:rPr>
+                <w:sz w:val="18"/>
+              </w:rPr>
+              <w:t>Sharpe-like paired t-test</w:t>
+            </w:r>
+          </w:p>
+        </w:tc>
+        <w:tc>
+          <w:tcPr>
+            <w:tcW w:type="dxa" w:w="2300"/>
+            <w:vAlign w:val="center"/>
+            <w:tcMar>
+              <w:top w:w="80" w:type="dxa"/>
+              <w:start w:w="120" w:type="dxa"/>
+              <w:bottom w:w="80" w:type="dxa"/>
+              <w:end w:w="120" w:type="dxa"/>
+            </w:tcMar>
+          </w:tcPr>
+          <w:p>
+            <w:r>
+              <w:rPr>
+                <w:sz w:val="18"/>
+              </w:rPr>
+              <w:t>p = 0.261</w:t>
+            </w:r>
+          </w:p>
+        </w:tc>
+        <w:tc>
+          <w:tcPr>
+            <w:tcW w:type="dxa" w:w="2560"/>
+            <w:vAlign w:val="center"/>
+            <w:tcMar>
+              <w:top w:w="80" w:type="dxa"/>
+              <w:start w:w="120" w:type="dxa"/>
+              <w:bottom w:w="80" w:type="dxa"/>
+              <w:end w:w="120" w:type="dxa"/>
+            </w:tcMar>
+          </w:tcPr>
+          <w:p>
+            <w:r>
+              <w:rPr>
+                <w:sz w:val="18"/>
+              </w:rPr>
+              <w:t>No significant Sharpe improvement.</w:t>
+            </w:r>
+          </w:p>
+        </w:tc>
+      </w:tr>
+      <w:tr>
+        <w:tc>
+          <w:tcPr>
+            <w:tcW w:type="dxa" w:w="2400"/>
+            <w:vAlign w:val="center"/>
+            <w:tcMar>
+              <w:top w:w="80" w:type="dxa"/>
+              <w:start w:w="120" w:type="dxa"/>
+              <w:bottom w:w="80" w:type="dxa"/>
+              <w:end w:w="120" w:type="dxa"/>
+            </w:tcMar>
+          </w:tcPr>
+          <w:p>
+            <w:r>
+              <w:rPr>
+                <w:sz w:val="18"/>
+              </w:rPr>
+              <w:t>PPO-aware vs PPO-blind</w:t>
+            </w:r>
+          </w:p>
+        </w:tc>
+        <w:tc>
+          <w:tcPr>
+            <w:tcW w:type="dxa" w:w="2100"/>
+            <w:vAlign w:val="center"/>
+            <w:tcMar>
+              <w:top w:w="80" w:type="dxa"/>
+              <w:start w:w="120" w:type="dxa"/>
+              <w:bottom w:w="80" w:type="dxa"/>
+              <w:end w:w="120" w:type="dxa"/>
+            </w:tcMar>
+          </w:tcPr>
+          <w:p>
+            <w:r>
+              <w:rPr>
+                <w:sz w:val="18"/>
+              </w:rPr>
+              <w:t>Final equity paired t-test</w:t>
+            </w:r>
+          </w:p>
+        </w:tc>
+        <w:tc>
+          <w:tcPr>
+            <w:tcW w:type="dxa" w:w="2300"/>
+            <w:vAlign w:val="center"/>
+            <w:tcMar>
+              <w:top w:w="80" w:type="dxa"/>
+              <w:start w:w="120" w:type="dxa"/>
+              <w:bottom w:w="80" w:type="dxa"/>
+              <w:end w:w="120" w:type="dxa"/>
+            </w:tcMar>
+          </w:tcPr>
+          <w:p>
+            <w:r>
+              <w:rPr>
+                <w:sz w:val="18"/>
+              </w:rPr>
+              <w:t>p = 0.023</w:t>
+            </w:r>
+          </w:p>
+        </w:tc>
+        <w:tc>
+          <w:tcPr>
+            <w:tcW w:type="dxa" w:w="2560"/>
+            <w:vAlign w:val="center"/>
+            <w:tcMar>
+              <w:top w:w="80" w:type="dxa"/>
+              <w:start w:w="120" w:type="dxa"/>
+              <w:bottom w:w="80" w:type="dxa"/>
+              <w:end w:w="120" w:type="dxa"/>
+            </w:tcMar>
+          </w:tcPr>
+          <w:p>
+            <w:r>
+              <w:rPr>
+                <w:sz w:val="18"/>
+              </w:rPr>
+              <w:t>Favors PPO-blind.</w:t>
+            </w:r>
+          </w:p>
+        </w:tc>
+      </w:tr>
+      <w:tr>
+        <w:tc>
+          <w:tcPr>
+            <w:tcW w:type="dxa" w:w="2400"/>
+            <w:vAlign w:val="center"/>
+            <w:tcMar>
+              <w:top w:w="80" w:type="dxa"/>
+              <w:start w:w="120" w:type="dxa"/>
+              <w:bottom w:w="80" w:type="dxa"/>
+              <w:end w:w="120" w:type="dxa"/>
+            </w:tcMar>
+          </w:tcPr>
+          <w:p>
+            <w:r>
+              <w:rPr>
+                <w:sz w:val="18"/>
+              </w:rPr>
+              <w:t>ppo_sigma_only vs ppo_oracle_full</w:t>
+            </w:r>
+          </w:p>
+        </w:tc>
+        <w:tc>
+          <w:tcPr>
+            <w:tcW w:type="dxa" w:w="2100"/>
+            <w:vAlign w:val="center"/>
+            <w:tcMar>
+              <w:top w:w="80" w:type="dxa"/>
+              <w:start w:w="120" w:type="dxa"/>
+              <w:bottom w:w="80" w:type="dxa"/>
+              <w:end w:w="120" w:type="dxa"/>
+            </w:tcMar>
+          </w:tcPr>
+          <w:p>
+            <w:r>
+              <w:rPr>
+                <w:sz w:val="18"/>
+              </w:rPr>
+              <w:t>Sharpe-like paired t-test</w:t>
+            </w:r>
+          </w:p>
+        </w:tc>
+        <w:tc>
+          <w:tcPr>
+            <w:tcW w:type="dxa" w:w="2300"/>
+            <w:vAlign w:val="center"/>
+            <w:tcMar>
+              <w:top w:w="80" w:type="dxa"/>
+              <w:start w:w="120" w:type="dxa"/>
+              <w:bottom w:w="80" w:type="dxa"/>
+              <w:end w:w="120" w:type="dxa"/>
+            </w:tcMar>
+          </w:tcPr>
+          <w:p>
+            <w:r>
+              <w:rPr>
+                <w:sz w:val="18"/>
+              </w:rPr>
+              <w:t>p = 0.115</w:t>
+            </w:r>
+          </w:p>
+        </w:tc>
+        <w:tc>
+          <w:tcPr>
+            <w:tcW w:type="dxa" w:w="2560"/>
+            <w:vAlign w:val="center"/>
+            <w:tcMar>
+              <w:top w:w="80" w:type="dxa"/>
+              <w:start w:w="120" w:type="dxa"/>
+              <w:bottom w:w="80" w:type="dxa"/>
+              <w:end w:w="120" w:type="dxa"/>
+            </w:tcMar>
+          </w:tcPr>
+          <w:p>
+            <w:r>
+              <w:rPr>
+                <w:sz w:val="18"/>
+              </w:rPr>
+              <w:t>No oracle-label Sharpe improvement.</w:t>
+            </w:r>
+          </w:p>
+        </w:tc>
+      </w:tr>
+      <w:tr>
+        <w:tc>
+          <w:tcPr>
+            <w:tcW w:type="dxa" w:w="2400"/>
+            <w:vAlign w:val="center"/>
+            <w:tcMar>
+              <w:top w:w="80" w:type="dxa"/>
+              <w:start w:w="120" w:type="dxa"/>
+              <w:bottom w:w="80" w:type="dxa"/>
+              <w:end w:w="120" w:type="dxa"/>
+            </w:tcMar>
+          </w:tcPr>
+          <w:p>
+            <w:r>
+              <w:rPr>
+                <w:sz w:val="18"/>
+              </w:rPr>
+              <w:t>ppo_sigma_only vs ppo_oracle_full</w:t>
+            </w:r>
+          </w:p>
+        </w:tc>
+        <w:tc>
+          <w:tcPr>
+            <w:tcW w:type="dxa" w:w="2100"/>
+            <w:vAlign w:val="center"/>
+            <w:tcMar>
+              <w:top w:w="80" w:type="dxa"/>
+              <w:start w:w="120" w:type="dxa"/>
+              <w:bottom w:w="80" w:type="dxa"/>
+              <w:end w:w="120" w:type="dxa"/>
+            </w:tcMar>
+          </w:tcPr>
+          <w:p>
+            <w:r>
+              <w:rPr>
+                <w:sz w:val="18"/>
+              </w:rPr>
+              <w:t>TOST +/-0.10</w:t>
+            </w:r>
+          </w:p>
+        </w:tc>
+        <w:tc>
+          <w:tcPr>
+            <w:tcW w:type="dxa" w:w="2300"/>
+            <w:vAlign w:val="center"/>
+            <w:tcMar>
+              <w:top w:w="80" w:type="dxa"/>
+              <w:start w:w="120" w:type="dxa"/>
+              <w:bottom w:w="80" w:type="dxa"/>
+              <w:end w:w="120" w:type="dxa"/>
+            </w:tcMar>
+          </w:tcPr>
+          <w:p>
+            <w:r>
+              <w:rPr>
+                <w:sz w:val="18"/>
+              </w:rPr>
+              <w:t>p = 0.00067; 90% CI [-0.001, +0.063]</w:t>
+            </w:r>
+          </w:p>
+        </w:tc>
+        <w:tc>
+          <w:tcPr>
+            <w:tcW w:type="dxa" w:w="2560"/>
+            <w:vAlign w:val="center"/>
+            <w:tcMar>
+              <w:top w:w="80" w:type="dxa"/>
+              <w:start w:w="120" w:type="dxa"/>
+              <w:bottom w:w="80" w:type="dxa"/>
+              <w:end w:w="120" w:type="dxa"/>
+            </w:tcMar>
+          </w:tcPr>
+          <w:p>
+            <w:r>
+              <w:rPr>
+                <w:sz w:val="18"/>
+              </w:rPr>
+              <w:t>Practical equivalence supported.</w:t>
+            </w:r>
+          </w:p>
+        </w:tc>
+      </w:tr>
+      <w:tr>
+        <w:tc>
+          <w:tcPr>
+            <w:tcW w:type="dxa" w:w="2400"/>
+            <w:vAlign w:val="center"/>
+            <w:tcMar>
+              <w:top w:w="80" w:type="dxa"/>
+              <w:start w:w="120" w:type="dxa"/>
+              <w:bottom w:w="80" w:type="dxa"/>
+              <w:end w:w="120" w:type="dxa"/>
+            </w:tcMar>
+          </w:tcPr>
+          <w:p>
+            <w:r>
+              <w:rPr>
+                <w:sz w:val="18"/>
+              </w:rPr>
+              <w:t>HMM detector</w:t>
+            </w:r>
+          </w:p>
+        </w:tc>
+        <w:tc>
+          <w:tcPr>
+            <w:tcW w:type="dxa" w:w="2100"/>
+            <w:vAlign w:val="center"/>
+            <w:tcMar>
+              <w:top w:w="80" w:type="dxa"/>
+              <w:start w:w="120" w:type="dxa"/>
+              <w:bottom w:w="80" w:type="dxa"/>
+              <w:end w:w="120" w:type="dxa"/>
+            </w:tcMar>
+          </w:tcPr>
+          <w:p>
+            <w:r>
+              <w:rPr>
+                <w:sz w:val="18"/>
+              </w:rPr>
+              <w:t>Detector accuracy</w:t>
+            </w:r>
+          </w:p>
+        </w:tc>
+        <w:tc>
+          <w:tcPr>
+            <w:tcW w:type="dxa" w:w="2300"/>
+            <w:vAlign w:val="center"/>
+            <w:tcMar>
+              <w:top w:w="80" w:type="dxa"/>
+              <w:start w:w="120" w:type="dxa"/>
+              <w:bottom w:w="80" w:type="dxa"/>
+              <w:end w:w="120" w:type="dxa"/>
+            </w:tcMar>
+          </w:tcPr>
+          <w:p>
+            <w:r>
+              <w:rPr>
+                <w:sz w:val="18"/>
+              </w:rPr>
+              <w:t>81.8%</w:t>
+            </w:r>
+          </w:p>
+        </w:tc>
+        <w:tc>
+          <w:tcPr>
+            <w:tcW w:type="dxa" w:w="2560"/>
+            <w:vAlign w:val="center"/>
+            <w:tcMar>
+              <w:top w:w="80" w:type="dxa"/>
+              <w:start w:w="120" w:type="dxa"/>
+              <w:bottom w:w="80" w:type="dxa"/>
+              <w:end w:w="120" w:type="dxa"/>
+            </w:tcMar>
+          </w:tcPr>
+          <w:p>
+            <w:r>
+              <w:rPr>
+                <w:sz w:val="18"/>
+              </w:rPr>
+              <w:t>Higher accuracy does not create advantage.</w:t>
+            </w:r>
+          </w:p>
+        </w:tc>
+      </w:tr>
+      <w:tr>
+        <w:tc>
+          <w:tcPr>
+            <w:tcW w:type="dxa" w:w="2400"/>
+            <w:vAlign w:val="center"/>
+            <w:tcMar>
+              <w:top w:w="80" w:type="dxa"/>
+              <w:start w:w="120" w:type="dxa"/>
+              <w:bottom w:w="80" w:type="dxa"/>
+              <w:end w:w="120" w:type="dxa"/>
+            </w:tcMar>
+          </w:tcPr>
+          <w:p>
+            <w:r>
+              <w:rPr>
+                <w:sz w:val="18"/>
+              </w:rPr>
+              <w:t>Detector robustness</w:t>
+            </w:r>
+          </w:p>
+        </w:tc>
+        <w:tc>
+          <w:tcPr>
+            <w:tcW w:type="dxa" w:w="2100"/>
+            <w:vAlign w:val="center"/>
+            <w:tcMar>
+              <w:top w:w="80" w:type="dxa"/>
+              <w:start w:w="120" w:type="dxa"/>
+              <w:bottom w:w="80" w:type="dxa"/>
+              <w:end w:w="120" w:type="dxa"/>
+            </w:tcMar>
+          </w:tcPr>
+          <w:p>
+            <w:r>
+              <w:rPr>
+                <w:sz w:val="18"/>
+              </w:rPr>
+              <w:t>ANOVA</w:t>
+            </w:r>
+          </w:p>
+        </w:tc>
+        <w:tc>
+          <w:tcPr>
+            <w:tcW w:type="dxa" w:w="2300"/>
+            <w:vAlign w:val="center"/>
+            <w:tcMar>
+              <w:top w:w="80" w:type="dxa"/>
+              <w:start w:w="120" w:type="dxa"/>
+              <w:bottom w:w="80" w:type="dxa"/>
+              <w:end w:w="120" w:type="dxa"/>
+            </w:tcMar>
+          </w:tcPr>
+          <w:p>
+            <w:r>
+              <w:rPr>
+                <w:sz w:val="18"/>
+              </w:rPr>
+              <w:t>p = 0.997</w:t>
+            </w:r>
+          </w:p>
+        </w:tc>
+        <w:tc>
+          <w:tcPr>
+            <w:tcW w:type="dxa" w:w="2560"/>
+            <w:vAlign w:val="center"/>
+            <w:tcMar>
+              <w:top w:w="80" w:type="dxa"/>
+              <w:start w:w="120" w:type="dxa"/>
+              <w:bottom w:w="80" w:type="dxa"/>
+              <w:end w:w="120" w:type="dxa"/>
+            </w:tcMar>
+          </w:tcPr>
+          <w:p>
+            <w:r>
+              <w:rPr>
+                <w:sz w:val="18"/>
+              </w:rPr>
+              <w:t>Detector choice does not explain result.</w:t>
+            </w:r>
+          </w:p>
+        </w:tc>
+      </w:tr>
+      <w:tr>
+        <w:tc>
+          <w:tcPr>
+            <w:tcW w:type="dxa" w:w="2400"/>
+            <w:vAlign w:val="center"/>
+            <w:tcMar>
+              <w:top w:w="80" w:type="dxa"/>
+              <w:start w:w="120" w:type="dxa"/>
+              <w:bottom w:w="80" w:type="dxa"/>
+              <w:end w:w="120" w:type="dxa"/>
+            </w:tcMar>
+          </w:tcPr>
+          <w:p>
+            <w:r>
+              <w:rPr>
+                <w:sz w:val="18"/>
+              </w:rPr>
+              <w:t>Regime-conditional eta</w:t>
+            </w:r>
+          </w:p>
+        </w:tc>
+        <w:tc>
+          <w:tcPr>
+            <w:tcW w:type="dxa" w:w="2100"/>
+            <w:vAlign w:val="center"/>
+            <w:tcMar>
+              <w:top w:w="80" w:type="dxa"/>
+              <w:start w:w="120" w:type="dxa"/>
+              <w:bottom w:w="80" w:type="dxa"/>
+              <w:end w:w="120" w:type="dxa"/>
+            </w:tcMar>
+          </w:tcPr>
+          <w:p>
+            <w:r>
+              <w:rPr>
+                <w:sz w:val="18"/>
+              </w:rPr>
+              <w:t>sigma_only vs combined Sharpe</w:t>
+            </w:r>
+          </w:p>
+        </w:tc>
+        <w:tc>
+          <w:tcPr>
+            <w:tcW w:type="dxa" w:w="2300"/>
+            <w:vAlign w:val="center"/>
+            <w:tcMar>
+              <w:top w:w="80" w:type="dxa"/>
+              <w:start w:w="120" w:type="dxa"/>
+              <w:bottom w:w="80" w:type="dxa"/>
+              <w:end w:w="120" w:type="dxa"/>
+            </w:tcMar>
+          </w:tcPr>
+          <w:p>
+            <w:r>
+              <w:rPr>
+                <w:sz w:val="18"/>
+              </w:rPr>
+              <w:t>p = 0.0016</w:t>
+            </w:r>
+          </w:p>
+        </w:tc>
+        <w:tc>
+          <w:tcPr>
+            <w:tcW w:type="dxa" w:w="2560"/>
+            <w:vAlign w:val="center"/>
+            <w:tcMar>
+              <w:top w:w="80" w:type="dxa"/>
+              <w:start w:w="120" w:type="dxa"/>
+              <w:bottom w:w="80" w:type="dxa"/>
+              <w:end w:w="120" w:type="dxa"/>
+            </w:tcMar>
+          </w:tcPr>
+          <w:p>
+            <w:r>
+              <w:rPr>
+                <w:sz w:val="18"/>
+              </w:rPr>
+              <w:t>Favors sigma_only.</w:t>
+            </w:r>
+          </w:p>
+        </w:tc>
+      </w:tr>
+      <w:tr>
+        <w:tc>
+          <w:tcPr>
+            <w:tcW w:type="dxa" w:w="2400"/>
+            <w:vAlign w:val="center"/>
+            <w:tcMar>
+              <w:top w:w="80" w:type="dxa"/>
+              <w:start w:w="120" w:type="dxa"/>
+              <w:bottom w:w="80" w:type="dxa"/>
+              <w:end w:w="120" w:type="dxa"/>
+            </w:tcMar>
+          </w:tcPr>
+          <w:p>
+            <w:r>
+              <w:rPr>
+                <w:sz w:val="18"/>
+              </w:rPr>
+              <w:t>Mild misspecification</w:t>
+            </w:r>
+          </w:p>
+        </w:tc>
+        <w:tc>
+          <w:tcPr>
+            <w:tcW w:type="dxa" w:w="2100"/>
+            <w:vAlign w:val="center"/>
+            <w:tcMar>
+              <w:top w:w="80" w:type="dxa"/>
+              <w:start w:w="120" w:type="dxa"/>
+              <w:bottom w:w="80" w:type="dxa"/>
+              <w:end w:w="120" w:type="dxa"/>
+            </w:tcMar>
+          </w:tcPr>
+          <w:p>
+            <w:r>
+              <w:rPr>
+                <w:sz w:val="18"/>
+              </w:rPr>
+              <w:t>sigma_only vs oracle_full Sharpe t-test</w:t>
+            </w:r>
+          </w:p>
+        </w:tc>
+        <w:tc>
+          <w:tcPr>
+            <w:tcW w:type="dxa" w:w="2300"/>
+            <w:vAlign w:val="center"/>
+            <w:tcMar>
+              <w:top w:w="80" w:type="dxa"/>
+              <w:start w:w="120" w:type="dxa"/>
+              <w:bottom w:w="80" w:type="dxa"/>
+              <w:end w:w="120" w:type="dxa"/>
+            </w:tcMar>
+          </w:tcPr>
+          <w:p>
+            <w:r>
+              <w:rPr>
+                <w:sz w:val="18"/>
+              </w:rPr>
+              <w:t>p = 0.881</w:t>
+            </w:r>
+          </w:p>
+        </w:tc>
+        <w:tc>
+          <w:tcPr>
+            <w:tcW w:type="dxa" w:w="2560"/>
+            <w:vAlign w:val="center"/>
+            <w:tcMar>
+              <w:top w:w="80" w:type="dxa"/>
+              <w:start w:w="120" w:type="dxa"/>
+              <w:bottom w:w="80" w:type="dxa"/>
+              <w:end w:w="120" w:type="dxa"/>
+            </w:tcMar>
+          </w:tcPr>
+          <w:p>
+            <w:r>
+              <w:rPr>
+                <w:sz w:val="18"/>
+              </w:rPr>
+              <w:t>No significant Sharpe difference.</w:t>
+            </w:r>
+          </w:p>
+        </w:tc>
+      </w:tr>
+      <w:tr>
+        <w:tc>
+          <w:tcPr>
+            <w:tcW w:type="dxa" w:w="2400"/>
+            <w:vAlign w:val="center"/>
+            <w:tcMar>
+              <w:top w:w="80" w:type="dxa"/>
+              <w:start w:w="120" w:type="dxa"/>
+              <w:bottom w:w="80" w:type="dxa"/>
+              <w:end w:w="120" w:type="dxa"/>
+            </w:tcMar>
+          </w:tcPr>
+          <w:p>
+            <w:r>
+              <w:rPr>
+                <w:sz w:val="18"/>
+              </w:rPr>
+              <w:t>Mild misspecification</w:t>
+            </w:r>
+          </w:p>
+        </w:tc>
+        <w:tc>
+          <w:tcPr>
+            <w:tcW w:type="dxa" w:w="2100"/>
+            <w:vAlign w:val="center"/>
+            <w:tcMar>
+              <w:top w:w="80" w:type="dxa"/>
+              <w:start w:w="120" w:type="dxa"/>
+              <w:bottom w:w="80" w:type="dxa"/>
+              <w:end w:w="120" w:type="dxa"/>
+            </w:tcMar>
+          </w:tcPr>
+          <w:p>
+            <w:r>
+              <w:rPr>
+                <w:sz w:val="18"/>
+              </w:rPr>
+              <w:t>TOST +/-0.05</w:t>
+            </w:r>
+          </w:p>
+        </w:tc>
+        <w:tc>
+          <w:tcPr>
+            <w:tcW w:type="dxa" w:w="2300"/>
+            <w:vAlign w:val="center"/>
+            <w:tcMar>
+              <w:top w:w="80" w:type="dxa"/>
+              <w:start w:w="120" w:type="dxa"/>
+              <w:bottom w:w="80" w:type="dxa"/>
+              <w:end w:w="120" w:type="dxa"/>
+            </w:tcMar>
+          </w:tcPr>
+          <w:p>
+            <w:r>
+              <w:rPr>
+                <w:sz w:val="18"/>
+              </w:rPr>
+              <w:t>p = 0.042</w:t>
+            </w:r>
+          </w:p>
+        </w:tc>
+        <w:tc>
+          <w:tcPr>
+            <w:tcW w:type="dxa" w:w="2560"/>
+            <w:vAlign w:val="center"/>
+            <w:tcMar>
+              <w:top w:w="80" w:type="dxa"/>
+              <w:start w:w="120" w:type="dxa"/>
+              <w:bottom w:w="80" w:type="dxa"/>
+              <w:end w:w="120" w:type="dxa"/>
+            </w:tcMar>
+          </w:tcPr>
+          <w:p>
+            <w:r>
+              <w:rPr>
+                <w:sz w:val="18"/>
+              </w:rPr>
+              <w:t>Practical equivalence supported.</w:t>
+            </w:r>
+          </w:p>
+        </w:tc>
+      </w:tr>
+    </w:tbl>
+    <w:p/>
+    <w:p>
+      <w:r>
+        <w:t>The t-test results show no significant Sharpe improvement from explicit regime labels, while the TOST result provides positive evidence of practical equivalence under the stated bound.</w:t>
       </w:r>
     </w:p>
     <w:p>
@@ -6915,13 +7516,25 @@
     </w:tbl>
     <w:p/>
     <w:p>
+      <w:r>
+        <w:t>The ANOVA statistic is retained as a descriptive robustness summary across detector-specific PPO-aware Sharpe values. Because the same seeds are shared across detector conditions, the primary inferential evidence remains the seed-paired detector-specific tests; the ANOVA should not be read as the sole formal test of a repeated-measures design.</w:t>
+      </w:r>
+    </w:p>
+    <w:p>
+      <w:r>
+        <w:t>The detector robustness table comes from the w5_detector_full robustness experiment, while the main WP5 OOS table in Section 8.1 comes from the w5_main experiment. Small differences in PPO-aware/blind means therefore reflect distinct frozen experiment batches, not an inconsistency.</w:t>
+      </w:r>
+    </w:p>
+    <w:p>
       <w:pPr>
+        <w:keepNext/>
+        <w:keepLines/>
         <w:jc w:val="center"/>
       </w:pPr>
       <w:r>
         <w:drawing>
           <wp:inline xmlns:a="http://schemas.openxmlformats.org/drawingml/2006/main" xmlns:pic="http://schemas.openxmlformats.org/drawingml/2006/picture">
-            <wp:extent cx="5577840" cy="3450698"/>
+            <wp:extent cx="5257800" cy="3252707"/>
             <wp:docPr id="5" name="Picture 5"/>
             <wp:cNvGraphicFramePr>
               <a:graphicFrameLocks noChangeAspect="1"/>
@@ -6942,7 +7555,7 @@
                   <pic:spPr>
                     <a:xfrm>
                       <a:off x="0" y="0"/>
-                      <a:ext cx="5577840" cy="3450698"/>
+                      <a:ext cx="5257800" cy="3252707"/>
                     </a:xfrm>
                     <a:prstGeom prst="rect"/>
                   </pic:spPr>
@@ -6956,10 +7569,11 @@
     <w:p>
       <w:pPr>
         <w:pStyle w:val="Caption"/>
+        <w:keepLines/>
         <w:jc w:val="center"/>
       </w:pPr>
       <w:r>
-        <w:t>Figure 5. Detector robustness across rv_baseline, rv_dwell, and HMM.</w:t>
+        <w:t>Figure 5. Detector robustness: rv_baseline, rv_dwell, and HMM all fail to create a reliable regime-aware PPO advantage.</w:t>
       </w:r>
     </w:p>
     <w:p>
@@ -6977,12 +7591,14 @@
     </w:p>
     <w:p>
       <w:pPr>
+        <w:keepNext/>
+        <w:keepLines/>
         <w:jc w:val="center"/>
       </w:pPr>
       <w:r>
         <w:drawing>
           <wp:inline xmlns:a="http://schemas.openxmlformats.org/drawingml/2006/main" xmlns:pic="http://schemas.openxmlformats.org/drawingml/2006/picture">
-            <wp:extent cx="5577840" cy="2318877"/>
+            <wp:extent cx="5257800" cy="2185827"/>
             <wp:docPr id="6" name="Picture 6"/>
             <wp:cNvGraphicFramePr>
               <a:graphicFrameLocks noChangeAspect="1"/>
@@ -7003,7 +7619,7 @@
                   <pic:spPr>
                     <a:xfrm>
                       <a:off x="0" y="0"/>
-                      <a:ext cx="5577840" cy="2318877"/>
+                      <a:ext cx="5257800" cy="2185827"/>
                     </a:xfrm>
                     <a:prstGeom prst="rect"/>
                   </pic:spPr>
@@ -7017,20 +7633,23 @@
     <w:p>
       <w:pPr>
         <w:pStyle w:val="Caption"/>
+        <w:keepLines/>
         <w:jc w:val="center"/>
       </w:pPr>
       <w:r>
-        <w:t>Figure 6. Regime-conditional eta summary.</w:t>
+        <w:t>Figure 6. Regime-conditional eta summary: changing the reward channel by regime still favors sigma_only over combined.</w:t>
       </w:r>
     </w:p>
     <w:p>
       <w:pPr>
+        <w:keepNext/>
+        <w:keepLines/>
         <w:jc w:val="center"/>
       </w:pPr>
       <w:r>
         <w:drawing>
           <wp:inline xmlns:a="http://schemas.openxmlformats.org/drawingml/2006/main" xmlns:pic="http://schemas.openxmlformats.org/drawingml/2006/picture">
-            <wp:extent cx="5577840" cy="3152692"/>
+            <wp:extent cx="5257800" cy="2971800"/>
             <wp:docPr id="7" name="Picture 7"/>
             <wp:cNvGraphicFramePr>
               <a:graphicFrameLocks noChangeAspect="1"/>
@@ -7051,7 +7670,7 @@
                   <pic:spPr>
                     <a:xfrm>
                       <a:off x="0" y="0"/>
-                      <a:ext cx="5577840" cy="3152692"/>
+                      <a:ext cx="5257800" cy="2971800"/>
                     </a:xfrm>
                     <a:prstGeom prst="rect"/>
                   </pic:spPr>
@@ -7065,10 +7684,11 @@
     <w:p>
       <w:pPr>
         <w:pStyle w:val="Caption"/>
+        <w:keepLines/>
         <w:jc w:val="center"/>
       </w:pPr>
       <w:r>
-        <w:t>Figure 7. Mild model-misspecification summary.</w:t>
+        <w:t>Figure 7. Mild model-misspecification summary: sigma_only and oracle_full remain close under regime-dependent execution parameters.</w:t>
       </w:r>
     </w:p>
     <w:p>
@@ -7843,17 +8463,29 @@
     <w:p/>
     <w:p>
       <w:r>
+        <w:t>Entries are mean +/- 95% confidence-interval half-width across 20 seeds, not standard deviations.</w:t>
+      </w:r>
+    </w:p>
+    <w:p>
+      <w:r>
         <w:t>WP6 did not support the original informativeness-threshold hypothesis within the tested calibration band. sigma_only remained high under informative conditions, while combined was directionally below sigma_only.</w:t>
       </w:r>
     </w:p>
     <w:p>
+      <w:r>
+        <w:t>The WP6 figures should be read as a refinement of the main finding rather than a new mechanism proof: they show that the tested sigma_hat degradation path did not reveal a regime-label advantage.</w:t>
+      </w:r>
+    </w:p>
+    <w:p>
       <w:pPr>
+        <w:keepNext/>
+        <w:keepLines/>
         <w:jc w:val="center"/>
       </w:pPr>
       <w:r>
         <w:drawing>
           <wp:inline xmlns:a="http://schemas.openxmlformats.org/drawingml/2006/main" xmlns:pic="http://schemas.openxmlformats.org/drawingml/2006/picture">
-            <wp:extent cx="5577840" cy="3497909"/>
+            <wp:extent cx="4800600" cy="3010495"/>
             <wp:docPr id="8" name="Picture 8"/>
             <wp:cNvGraphicFramePr>
               <a:graphicFrameLocks noChangeAspect="1"/>
@@ -7874,7 +8506,7 @@
                   <pic:spPr>
                     <a:xfrm>
                       <a:off x="0" y="0"/>
-                      <a:ext cx="5577840" cy="3497909"/>
+                      <a:ext cx="4800600" cy="3010495"/>
                     </a:xfrm>
                     <a:prstGeom prst="rect"/>
                   </pic:spPr>
@@ -7888,20 +8520,28 @@
     <w:p>
       <w:pPr>
         <w:pStyle w:val="Caption"/>
+        <w:keepLines/>
         <w:jc w:val="center"/>
       </w:pPr>
       <w:r>
-        <w:t>Figure 8. WP6 monotonic-gap plot.</w:t>
+        <w:t>Figure 8. WP6 monotonic-gap plot: the expected narrowing of the sigma_only versus combined gap does not appear in the tested calibration band.</w:t>
+      </w:r>
+    </w:p>
+    <w:p>
+      <w:r>
+        <w:t>The paired-seed views below show whether aggregate differences are broad across seeds or driven by a few runs.</w:t>
       </w:r>
     </w:p>
     <w:p>
       <w:pPr>
+        <w:keepNext/>
+        <w:keepLines/>
         <w:jc w:val="center"/>
       </w:pPr>
       <w:r>
         <w:drawing>
           <wp:inline xmlns:a="http://schemas.openxmlformats.org/drawingml/2006/main" xmlns:pic="http://schemas.openxmlformats.org/drawingml/2006/picture">
-            <wp:extent cx="5577840" cy="5938821"/>
+            <wp:extent cx="4800600" cy="5111280"/>
             <wp:docPr id="9" name="Picture 9"/>
             <wp:cNvGraphicFramePr>
               <a:graphicFrameLocks noChangeAspect="1"/>
@@ -7922,7 +8562,7 @@
                   <pic:spPr>
                     <a:xfrm>
                       <a:off x="0" y="0"/>
-                      <a:ext cx="5577840" cy="5938821"/>
+                      <a:ext cx="4800600" cy="5111280"/>
                     </a:xfrm>
                     <a:prstGeom prst="rect"/>
                   </pic:spPr>
@@ -7936,20 +8576,23 @@
     <w:p>
       <w:pPr>
         <w:pStyle w:val="Caption"/>
+        <w:keepLines/>
         <w:jc w:val="center"/>
       </w:pPr>
       <w:r>
-        <w:t>Figure 9. WP6 paired-seed combined versus sigma_only.</w:t>
+        <w:t>Figure 9. WP6 paired-seed combined versus sigma_only: combined is directionally below sigma_only in informative conditions.</w:t>
       </w:r>
     </w:p>
     <w:p>
       <w:pPr>
+        <w:keepNext/>
+        <w:keepLines/>
         <w:jc w:val="center"/>
       </w:pPr>
       <w:r>
         <w:drawing>
           <wp:inline xmlns:a="http://schemas.openxmlformats.org/drawingml/2006/main" xmlns:pic="http://schemas.openxmlformats.org/drawingml/2006/picture">
-            <wp:extent cx="5577840" cy="5938821"/>
+            <wp:extent cx="4800600" cy="5111280"/>
             <wp:docPr id="10" name="Picture 10"/>
             <wp:cNvGraphicFramePr>
               <a:graphicFrameLocks noChangeAspect="1"/>
@@ -7970,7 +8613,7 @@
                   <pic:spPr>
                     <a:xfrm>
                       <a:off x="0" y="0"/>
-                      <a:ext cx="5577840" cy="5938821"/>
+                      <a:ext cx="4800600" cy="5111280"/>
                     </a:xfrm>
                     <a:prstGeom prst="rect"/>
                   </pic:spPr>
@@ -7984,10 +8627,11 @@
     <w:p>
       <w:pPr>
         <w:pStyle w:val="Caption"/>
+        <w:keepLines/>
         <w:jc w:val="center"/>
       </w:pPr>
       <w:r>
-        <w:t>Figure 10. WP6 paired-seed combined versus regime_only.</w:t>
+        <w:t>Figure 10. WP6 paired-seed combined versus regime_only: this diagnostic bounds how much sigma_hat is used inside the combined variant.</w:t>
       </w:r>
     </w:p>
     <w:p>
@@ -8029,12 +8673,12 @@
           <w:b/>
           <w:sz w:val="22"/>
         </w:rPr>
-        <w:t>Sharpe-like = mean(r_t) / std(r_t)</w:t>
+        <w:t>(16)  Sharpe-like = mean(g_t) / std(g_t)</w:t>
       </w:r>
     </w:p>
     <w:p>
       <w:r>
-        <w:t>Here r_t denotes the per-step or per-episode return series used by the project metric convention. This is the primary risk-adjusted performance metric.</w:t>
+        <w:t>Here g_t denotes the logged per-step PnL or return-like series used by the project metric convention. This is the primary risk-adjusted performance metric.</w:t>
       </w:r>
     </w:p>
     <w:p>
@@ -8055,7 +8699,7 @@
           <w:b/>
           <w:sz w:val="22"/>
         </w:rPr>
-        <w:t>inv_p99 = percentile_99(|q_t|)</w:t>
+        <w:t>(17)  inv_p99 = percentile_99(|q_t|)</w:t>
       </w:r>
     </w:p>
     <w:p>
@@ -8081,7 +8725,7 @@
           <w:b/>
           <w:sz w:val="22"/>
         </w:rPr>
-        <w:t>fill_rate = filled quote opportunities / total quote opportunities</w:t>
+        <w:t>(18)  fill_rate = filled quote opportunities / total quote opportunities</w:t>
       </w:r>
     </w:p>
     <w:p>
@@ -8107,7 +8751,7 @@
           <w:b/>
           <w:sz w:val="22"/>
         </w:rPr>
-        <w:t>t = mean(d_i) / (sd(d_i) / sqrt(n))</w:t>
+        <w:t>(19)  t = mean(d_i) / (sd(d_i) / sqrt(n))</w:t>
       </w:r>
     </w:p>
     <w:p>
@@ -9652,6 +10296,94 @@
         <w:pStyle w:val="Heading1"/>
       </w:pPr>
       <w:r>
+        <w:t>References</w:t>
+      </w:r>
+    </w:p>
+    <w:p>
+      <w:pPr>
+        <w:ind w:left="360" w:hanging="360"/>
+      </w:pPr>
+      <w:r>
+        <w:t>Avellaneda, M., &amp; Stoikov, S. (2008). High-frequency trading in a limit order book. Quantitative Finance, 8(3), 217-224. https://doi.org/10.1080/14697680701381228</w:t>
+      </w:r>
+    </w:p>
+    <w:p>
+      <w:pPr>
+        <w:ind w:left="360" w:hanging="360"/>
+      </w:pPr>
+      <w:r>
+        <w:t>Gueant, O., Lehalle, C.-A., &amp; Fernandez-Tapia, J. (2013). Dealing with the inventory risk: a solution to the market making problem. Mathematics and Financial Economics, 7, 477-507. https://doi.org/10.1007/s11579-012-0087-0</w:t>
+      </w:r>
+    </w:p>
+    <w:p>
+      <w:pPr>
+        <w:ind w:left="360" w:hanging="360"/>
+      </w:pPr>
+      <w:r>
+        <w:t>Spooner, T., Fearnley, J., Savani, R., &amp; Koukorinis, A. (2018). Market Making via Reinforcement Learning. Proceedings of the 17th International Conference on Autonomous Agents and MultiAgent Systems, 434-442.</w:t>
+      </w:r>
+    </w:p>
+    <w:p>
+      <w:pPr>
+        <w:ind w:left="360" w:hanging="360"/>
+      </w:pPr>
+      <w:r>
+        <w:t>Spooner, T., &amp; Savani, R. (2020). Robust market making via adversarial reinforcement learning. Proceedings of the Twenty-Ninth International Joint Conference on Artificial Intelligence, 4590-4596. https://doi.org/10.24963/ijcai.2020/633</w:t>
+      </w:r>
+    </w:p>
+    <w:p>
+      <w:pPr>
+        <w:ind w:left="360" w:hanging="360"/>
+      </w:pPr>
+      <w:r>
+        <w:t>Gasperov, B., &amp; Kostanjcar, Z. (2021). Market Making With Signals Through Deep Reinforcement Learning. IEEE Access, 9, 61611-61622. https://doi.org/10.1109/ACCESS.2021.3074782</w:t>
+      </w:r>
+    </w:p>
+    <w:p>
+      <w:pPr>
+        <w:ind w:left="360" w:hanging="360"/>
+      </w:pPr>
+      <w:r>
+        <w:t>Gasperov, B., Begusic, S., Posedel Simovic, P., &amp; Kostanjcar, Z. (2021). Reinforcement Learning Approaches to Optimal Market Making. Mathematics, 9(21), 2689. https://doi.org/10.3390/math9212689</w:t>
+      </w:r>
+    </w:p>
+    <w:p>
+      <w:pPr>
+        <w:ind w:left="360" w:hanging="360"/>
+      </w:pPr>
+      <w:r>
+        <w:t>Gasperov, B., &amp; Kostanjcar, Z. (2022). Deep Reinforcement Learning for Market Making Under a Hawkes Process-Based Limit Order Book Model. IEEE Control Systems Letters, 6, 2485-2490. https://doi.org/10.1109/LCSYS.2022.3166446</w:t>
+      </w:r>
+    </w:p>
+    <w:p>
+      <w:pPr>
+        <w:ind w:left="360" w:hanging="360"/>
+      </w:pPr>
+      <w:r>
+        <w:t>Schulman, J., Wolski, F., Dhariwal, P., Radford, A., &amp; Klimov, O. (2017). Proximal Policy Optimization Algorithms. arXiv:1707.06347.</w:t>
+      </w:r>
+    </w:p>
+    <w:p>
+      <w:pPr>
+        <w:ind w:left="360" w:hanging="360"/>
+      </w:pPr>
+      <w:r>
+        <w:t>Lakens, D. (2017). Equivalence tests: A practical primer for t tests, correlations, and meta-analyses. Social Psychological and Personality Science, 8(4), 355-362. https://doi.org/10.1177/1948550617697177</w:t>
+      </w:r>
+    </w:p>
+    <w:p>
+      <w:pPr>
+        <w:ind w:left="360" w:hanging="360"/>
+      </w:pPr>
+      <w:r>
+        <w:t>Lakens, D., Scheel, A. M., &amp; Isager, P. M. (2018). Equivalence testing for psychological research: A tutorial. Advances in Methods and Practices in Psychological Science, 1(2), 259-269. https://doi.org/10.1177/2515245918770963</w:t>
+      </w:r>
+    </w:p>
+    <w:p>
+      <w:pPr>
+        <w:pStyle w:val="Heading1"/>
+      </w:pPr>
+      <w:r>
         <w:t>Appendix A Code Appendix</w:t>
       </w:r>
     </w:p>
@@ -10356,12 +11088,14 @@
     </w:p>
     <w:p>
       <w:pPr>
+        <w:keepNext/>
+        <w:keepLines/>
         <w:jc w:val="center"/>
       </w:pPr>
       <w:r>
         <w:drawing>
           <wp:inline xmlns:a="http://schemas.openxmlformats.org/drawingml/2006/main" xmlns:pic="http://schemas.openxmlformats.org/drawingml/2006/picture">
-            <wp:extent cx="5577840" cy="3346704"/>
+            <wp:extent cx="5257800" cy="3154680"/>
             <wp:docPr id="11" name="Picture 11"/>
             <wp:cNvGraphicFramePr>
               <a:graphicFrameLocks noChangeAspect="1"/>
@@ -10382,7 +11116,7 @@
                   <pic:spPr>
                     <a:xfrm>
                       <a:off x="0" y="0"/>
-                      <a:ext cx="5577840" cy="3346704"/>
+                      <a:ext cx="5257800" cy="3154680"/>
                     </a:xfrm>
                     <a:prstGeom prst="rect"/>
                   </pic:spPr>
@@ -10396,6 +11130,7 @@
     <w:p>
       <w:pPr>
         <w:pStyle w:val="Caption"/>
+        <w:keepLines/>
         <w:jc w:val="center"/>
       </w:pPr>
       <w:r>
@@ -10404,12 +11139,14 @@
     </w:p>
     <w:p>
       <w:pPr>
+        <w:keepNext/>
+        <w:keepLines/>
         <w:jc w:val="center"/>
       </w:pPr>
       <w:r>
         <w:drawing>
           <wp:inline xmlns:a="http://schemas.openxmlformats.org/drawingml/2006/main" xmlns:pic="http://schemas.openxmlformats.org/drawingml/2006/picture">
-            <wp:extent cx="5577840" cy="2185910"/>
+            <wp:extent cx="5257800" cy="2060489"/>
             <wp:docPr id="12" name="Picture 12"/>
             <wp:cNvGraphicFramePr>
               <a:graphicFrameLocks noChangeAspect="1"/>
@@ -10430,7 +11167,7 @@
                   <pic:spPr>
                     <a:xfrm>
                       <a:off x="0" y="0"/>
-                      <a:ext cx="5577840" cy="2185910"/>
+                      <a:ext cx="5257800" cy="2060489"/>
                     </a:xfrm>
                     <a:prstGeom prst="rect"/>
                   </pic:spPr>
@@ -10444,10 +11181,21 @@
     <w:p>
       <w:pPr>
         <w:pStyle w:val="Caption"/>
+        <w:keepLines/>
         <w:jc w:val="center"/>
       </w:pPr>
       <w:r>
         <w:t>Appendix Figure C2. Regime-wise Sharpe diagnostic.</w:t>
+      </w:r>
+    </w:p>
+    <w:p>
+      <w:r>
+        <w:br w:type="page"/>
+      </w:r>
+    </w:p>
+    <w:p>
+      <w:r>
+        <w:t>The table below summarizes supporting diagnostics. These items support interpretation and provenance; they do not replace the canonical WP5/WP6 evidence chain used for the main claims.</w:t>
       </w:r>
     </w:p>
     <w:tbl>
@@ -10781,6 +11529,11 @@
       </w:tr>
     </w:tbl>
     <w:p/>
+    <w:p>
+      <w:r>
+        <w:t>This separation keeps the appendix readable while preserving the boundary between primary experiment evidence and supporting diagnostics.</w:t>
+      </w:r>
+    </w:p>
     <w:sectPr>
       <w:headerReference w:type="default" r:id="rId9"/>
       <w:footerReference w:type="default" r:id="rId10"/>
@@ -10823,7 +11576,7 @@
         <w:color w:val="555555"/>
         <w:sz w:val="18"/>
       </w:rPr>
-      <w:t>HFMM-RL Thesis 31 Template Draft</w:t>
+      <w:t>HFMM-RL MSc Thesis Draft</w:t>
     </w:r>
   </w:p>
 </w:hdr>

</xml_diff>